<commit_message>
docs: session summary through phase 36 (decade report card capstone)
Co-Authored-By: Claude Fable 5 <noreply@anthropic.com>
</commit_message>
<xml_diff>
--- a/reports/published/session_summary_2026-07-19.docx
+++ b/reports/published/session_summary_2026-07-19.docx
@@ -1784,6 +1784,48 @@
           </w:p>
         </w:tc>
       </w:tr>
+      <w:tr>
+        <w:tc>
+          <w:tcPr>
+            <w:tcW w:type="dxa" w:w="2160"/>
+          </w:tcPr>
+          <w:p>
+            <w:r>
+              <w:t>36</w:t>
+            </w:r>
+          </w:p>
+        </w:tc>
+        <w:tc>
+          <w:tcPr>
+            <w:tcW w:type="dxa" w:w="2160"/>
+          </w:tcPr>
+          <w:p>
+            <w:r>
+              <w:t>The decade report card -- 2014-2026 graded, open windows, ministries to approach</w:t>
+            </w:r>
+          </w:p>
+        </w:tc>
+        <w:tc>
+          <w:tcPr>
+            <w:tcW w:type="dxa" w:w="2160"/>
+          </w:tcPr>
+          <w:p>
+            <w:r>
+              <w:t>india-trade-sector-policy-recommendations</w:t>
+            </w:r>
+          </w:p>
+        </w:tc>
+        <w:tc>
+          <w:tcPr>
+            <w:tcW w:type="dxa" w:w="2160"/>
+          </w:tcPr>
+          <w:p>
+            <w:r>
+              <w:t>The program's capstone one-pager in three parts: (1) twelve years of policy graded on delivered outcomes -- the A-row (ethanol, M-SIPS-&gt;LSEM mobiles, UJALA, MUDRA, Startup India, UDAN, FAME, coal auctions, PLI Pharma) is uniformly demand-side guarantee/procurement designs, the D…</w:t>
+            </w:r>
+          </w:p>
+        </w:tc>
+      </w:tr>
     </w:tbl>
     <w:p/>
     <w:p>
@@ -1951,7 +1993,7 @@
     </w:p>
     <w:p>
       <w:r>
-        <w:t>All 35 phases published and pushed (latest commit 1d4a1ab). The repo now carries 26 bulletins, the 12-page NITI-template quarterly report with its linked-movements roster and matured-schemes section, the 13-document retrospective quarterly series (FY2014-15 -&gt; FY2026-27), the 122,141-release PIB SQL register (2017-2026) with a 154-launch classified Cabinet dataset, the site-verified ministry catalog, the scheme registry with displayed corrections, and the investor workflow. The matured-cohort verdict -- every closed-success loop ran on a demand-side guarantee or procurement design, on an ~8-10 year timescale -- is the program's capstone empirical finding, and 2025-26's instrument wave is, in hindsight, a reversion to that proven family.</w:t>
+        <w:t>All 36 phases published and pushed (latest commit 368350d). The program closes with the decade report card as its synthesis: 27 bulletins, the NITI-template quarterly report + linked-movements roster, the 13-document retrospective series, the 122,141-release PIB register with a 154-launch classified Cabinet dataset, the matured cohort's capstone finding (closed-success loops run on demand-side guarantee/procurement designs over ~8-10 years), the site-verified ministry catalog, the scheme registry with displayed corrections, the investor workflow, and the decade report card grading 2014-2026 with open windows and a three-tier ministry approach list for investors.</w:t>
       </w:r>
     </w:p>
     <w:sectPr>

</xml_diff>

<commit_message>
docs: session summary through phase 37 (focus-sector-investor-map repo)
Co-Authored-By: Claude Fable 5 <noreply@anthropic.com>
</commit_message>
<xml_diff>
--- a/reports/published/session_summary_2026-07-19.docx
+++ b/reports/published/session_summary_2026-07-19.docx
@@ -1826,6 +1826,48 @@
           </w:p>
         </w:tc>
       </w:tr>
+      <w:tr>
+        <w:tc>
+          <w:tcPr>
+            <w:tcW w:type="dxa" w:w="2160"/>
+          </w:tcPr>
+          <w:p>
+            <w:r>
+              <w:t>37</w:t>
+            </w:r>
+          </w:p>
+        </w:tc>
+        <w:tc>
+          <w:tcPr>
+            <w:tcW w:type="dxa" w:w="2160"/>
+          </w:tcPr>
+          <w:p>
+            <w:r>
+              <w:t>New repo: focus-sector-investor-map -- companies x government initiatives</w:t>
+            </w:r>
+          </w:p>
+        </w:tc>
+        <w:tc>
+          <w:tcPr>
+            <w:tcW w:type="dxa" w:w="2160"/>
+          </w:tcPr>
+          <w:p>
+            <w:r>
+              <w:t>focus-sector-investor-map (new, public)</w:t>
+            </w:r>
+          </w:p>
+        </w:tc>
+        <w:tc>
+          <w:tcPr>
+            <w:tcW w:type="dxa" w:w="2160"/>
+          </w:tcPr>
+          <w:p>
+            <w:r>
+              <w:t>Bridged the policy program and the market-data stack in a new public repo: the 38,495-company multi-market universe joined to Damodaran's 48,156-company industry classification and mapped into the program's 12 focus sectors -&gt; 894 liquid, market-validated companies -&gt; 175-name s…</w:t>
+            </w:r>
+          </w:p>
+        </w:tc>
+      </w:tr>
     </w:tbl>
     <w:p/>
     <w:p>
@@ -1993,7 +2035,7 @@
     </w:p>
     <w:p>
       <w:r>
-        <w:t>All 36 phases published and pushed (latest commit 368350d). The program closes with the decade report card as its synthesis: 27 bulletins, the NITI-template quarterly report + linked-movements roster, the 13-document retrospective series, the 122,141-release PIB register with a 154-launch classified Cabinet dataset, the matured cohort's capstone finding (closed-success loops run on demand-side guarantee/procurement designs over ~8-10 years), the site-verified ministry catalog, the scheme registry with displayed corrections, the investor workflow, and the decade report card grading 2014-2026 with open windows and a three-tier ministry approach list for investors.</w:t>
+        <w:t>All 37 phases published. Three public repos now carry the program: india-trade-data-analysis (descriptive), india-trade-sector-policy-recommendations (prescriptive: 27 bulletins, quarterly report + retrospective series, 122k-release PIB register, matured-cohort verdicts, decade report card, investor workflow), and the new focus-sector-investor-map (the bridge to the market-data stack: 894 screened companies, 147 verified-profitable, and the foreign-investor x initiative pairing table with verified, prospective and deliberately-retained stalled pairs).</w:t>
       </w:r>
     </w:p>
     <w:sectPr>

</xml_diff>

<commit_message>
feat: master ministry list (86 entities from the register, 16 cataloged) + session summary through phase 38
Master list derived from the program's own PIB register: every publishing
ministry/department with release counts and date spans; 16 flagged CATALOGED
from the incentive sweep, the remaining 70 marked PENDING SWEEP as the stated
next step (priority: Finance, Defence, S&T, Agriculture, Power, MoHUA,
Road Transport, Railways, Tourism, Skill Development).

Co-Authored-By: Claude Fable 5 <noreply@anthropic.com>
</commit_message>
<xml_diff>
--- a/reports/published/session_summary_2026-07-19.docx
+++ b/reports/published/session_summary_2026-07-19.docx
@@ -1868,6 +1868,48 @@
           </w:p>
         </w:tc>
       </w:tr>
+      <w:tr>
+        <w:tc>
+          <w:tcPr>
+            <w:tcW w:type="dxa" w:w="2160"/>
+          </w:tcPr>
+          <w:p>
+            <w:r>
+              <w:t>38</w:t>
+            </w:r>
+          </w:p>
+        </w:tc>
+        <w:tc>
+          <w:tcPr>
+            <w:tcW w:type="dxa" w:w="2160"/>
+          </w:tcPr>
+          <w:p>
+            <w:r>
+              <w:t>Investor map bulletin (coverage-first, global) + master ministry list</w:t>
+            </w:r>
+          </w:p>
+        </w:tc>
+        <w:tc>
+          <w:tcPr>
+            <w:tcW w:type="dxa" w:w="2160"/>
+          </w:tcPr>
+          <w:p>
+            <w:r>
+              <w:t>india-trade-sector-policy-recommendations + focus-sector-investor-map</w:t>
+            </w:r>
+          </w:p>
+        </w:tc>
+        <w:tc>
+          <w:tcPr>
+            <w:tcW w:type="dxa" w:w="2160"/>
+          </w:tcPr>
+          <w:p>
+            <w:r>
+              <w:t>Rebuilt the investor map coverage-first per direction: the full Damodaran classification universe mapped to the 12 incentivized sectors WITHOUT a profitability gate -- 19,795 companies across 107 countries (profitability stays a per-name attribute, 147 verified). Published as a…</w:t>
+            </w:r>
+          </w:p>
+        </w:tc>
+      </w:tr>
     </w:tbl>
     <w:p/>
     <w:p>
@@ -2035,7 +2077,7 @@
     </w:p>
     <w:p>
       <w:r>
-        <w:t>All 37 phases published. Three public repos now carry the program: india-trade-data-analysis (descriptive), india-trade-sector-policy-recommendations (prescriptive: 27 bulletins, quarterly report + retrospective series, 122k-release PIB register, matured-cohort verdicts, decade report card, investor workflow), and the new focus-sector-investor-map (the bridge to the market-data stack: 894 screened companies, 147 verified-profitable, and the foreign-investor x initiative pairing table with verified, prospective and deliberately-retained stalled pairs).</w:t>
+        <w:t>All 38 phases published across three public repos. The investor layer is complete coverage-first (19,795 companies/107 countries mapped to the incentivized sectors, with verified-profitability and pairing attribute layers), and the ministry universe is now enumerated in full (86 entities from the register; 16 incentive-cataloged, 70 pending the next sweep).</w:t>
       </w:r>
     </w:p>
     <w:sectPr>

</xml_diff>

<commit_message>
docs: session summary phase 39 -- digital-twin-for-ipa repo (86/86 sweep, interlinkage graph, PRS layer)
Co-Authored-By: Claude Fable 5 <noreply@anthropic.com>
</commit_message>
<xml_diff>
--- a/reports/published/session_summary_2026-07-19.docx
+++ b/reports/published/session_summary_2026-07-19.docx
@@ -7,7 +7,7 @@
         <w:pStyle w:val="Title"/>
       </w:pPr>
       <w:r>
-        <w:t>Session Summary — India Trade Policy Program (2026-07-18 → 2026-07-20)</w:t>
+        <w:t>Session Summary -- India Trade &amp; Policy Program (through 2026-07-20)</w:t>
       </w:r>
     </w:p>
     <w:p>
@@ -225,15 +225,16 @@
         <w:tblLook w:firstColumn="1" w:firstRow="1" w:lastColumn="0" w:lastRow="0" w:noHBand="0" w:noVBand="1" w:val="04A0"/>
       </w:tblPr>
       <w:tblGrid>
-        <w:gridCol w:w="2160"/>
-        <w:gridCol w:w="2160"/>
-        <w:gridCol w:w="2160"/>
-        <w:gridCol w:w="2160"/>
+        <w:gridCol w:w="1728"/>
+        <w:gridCol w:w="1728"/>
+        <w:gridCol w:w="1728"/>
+        <w:gridCol w:w="1728"/>
+        <w:gridCol w:w="1728"/>
       </w:tblGrid>
       <w:tr>
         <w:tc>
           <w:tcPr>
-            <w:tcW w:type="dxa" w:w="2160"/>
+            <w:tcW w:type="dxa" w:w="1728"/>
           </w:tcPr>
           <w:p>
             <w:r>
@@ -243,7 +244,7 @@
         </w:tc>
         <w:tc>
           <w:tcPr>
-            <w:tcW w:type="dxa" w:w="2160"/>
+            <w:tcW w:type="dxa" w:w="1728"/>
           </w:tcPr>
           <w:p>
             <w:r>
@@ -253,7 +254,7 @@
         </w:tc>
         <w:tc>
           <w:tcPr>
-            <w:tcW w:type="dxa" w:w="2160"/>
+            <w:tcW w:type="dxa" w:w="1728"/>
           </w:tcPr>
           <w:p>
             <w:r>
@@ -263,7 +264,7 @@
         </w:tc>
         <w:tc>
           <w:tcPr>
-            <w:tcW w:type="dxa" w:w="2160"/>
+            <w:tcW w:type="dxa" w:w="1728"/>
           </w:tcPr>
           <w:p>
             <w:r>
@@ -271,11 +272,21 @@
             </w:r>
           </w:p>
         </w:tc>
+        <w:tc>
+          <w:tcPr>
+            <w:tcW w:type="dxa" w:w="1728"/>
+          </w:tcPr>
+          <w:p>
+            <w:r>
+              <w:t>Details</w:t>
+            </w:r>
+          </w:p>
+        </w:tc>
       </w:tr>
       <w:tr>
         <w:tc>
           <w:tcPr>
-            <w:tcW w:type="dxa" w:w="2160"/>
+            <w:tcW w:type="dxa" w:w="1728"/>
           </w:tcPr>
           <w:p>
             <w:r>
@@ -285,7 +296,7 @@
         </w:tc>
         <w:tc>
           <w:tcPr>
-            <w:tcW w:type="dxa" w:w="2160"/>
+            <w:tcW w:type="dxa" w:w="1728"/>
           </w:tcPr>
           <w:p>
             <w:r>
@@ -295,7 +306,7 @@
         </w:tc>
         <w:tc>
           <w:tcPr>
-            <w:tcW w:type="dxa" w:w="2160"/>
+            <w:tcW w:type="dxa" w:w="1728"/>
           </w:tcPr>
           <w:p>
             <w:r>
@@ -305,7 +316,7 @@
         </w:tc>
         <w:tc>
           <w:tcPr>
-            <w:tcW w:type="dxa" w:w="2160"/>
+            <w:tcW w:type="dxa" w:w="1728"/>
           </w:tcPr>
           <w:p>
             <w:r>
@@ -313,11 +324,19 @@
             </w:r>
           </w:p>
         </w:tc>
+        <w:tc>
+          <w:tcPr>
+            <w:tcW w:type="dxa" w:w="1728"/>
+          </w:tcPr>
+          <w:p>
+            <w:r/>
+          </w:p>
+        </w:tc>
       </w:tr>
       <w:tr>
         <w:tc>
           <w:tcPr>
-            <w:tcW w:type="dxa" w:w="2160"/>
+            <w:tcW w:type="dxa" w:w="1728"/>
           </w:tcPr>
           <w:p>
             <w:r>
@@ -327,7 +346,7 @@
         </w:tc>
         <w:tc>
           <w:tcPr>
-            <w:tcW w:type="dxa" w:w="2160"/>
+            <w:tcW w:type="dxa" w:w="1728"/>
           </w:tcPr>
           <w:p>
             <w:r>
@@ -337,7 +356,7 @@
         </w:tc>
         <w:tc>
           <w:tcPr>
-            <w:tcW w:type="dxa" w:w="2160"/>
+            <w:tcW w:type="dxa" w:w="1728"/>
           </w:tcPr>
           <w:p>
             <w:r>
@@ -347,7 +366,7 @@
         </w:tc>
         <w:tc>
           <w:tcPr>
-            <w:tcW w:type="dxa" w:w="2160"/>
+            <w:tcW w:type="dxa" w:w="1728"/>
           </w:tcPr>
           <w:p>
             <w:r>
@@ -355,11 +374,19 @@
             </w:r>
           </w:p>
         </w:tc>
+        <w:tc>
+          <w:tcPr>
+            <w:tcW w:type="dxa" w:w="1728"/>
+          </w:tcPr>
+          <w:p>
+            <w:r/>
+          </w:p>
+        </w:tc>
       </w:tr>
       <w:tr>
         <w:tc>
           <w:tcPr>
-            <w:tcW w:type="dxa" w:w="2160"/>
+            <w:tcW w:type="dxa" w:w="1728"/>
           </w:tcPr>
           <w:p>
             <w:r>
@@ -369,7 +396,7 @@
         </w:tc>
         <w:tc>
           <w:tcPr>
-            <w:tcW w:type="dxa" w:w="2160"/>
+            <w:tcW w:type="dxa" w:w="1728"/>
           </w:tcPr>
           <w:p>
             <w:r>
@@ -379,7 +406,7 @@
         </w:tc>
         <w:tc>
           <w:tcPr>
-            <w:tcW w:type="dxa" w:w="2160"/>
+            <w:tcW w:type="dxa" w:w="1728"/>
           </w:tcPr>
           <w:p>
             <w:r>
@@ -389,7 +416,7 @@
         </w:tc>
         <w:tc>
           <w:tcPr>
-            <w:tcW w:type="dxa" w:w="2160"/>
+            <w:tcW w:type="dxa" w:w="1728"/>
           </w:tcPr>
           <w:p>
             <w:r>
@@ -397,11 +424,19 @@
             </w:r>
           </w:p>
         </w:tc>
+        <w:tc>
+          <w:tcPr>
+            <w:tcW w:type="dxa" w:w="1728"/>
+          </w:tcPr>
+          <w:p>
+            <w:r/>
+          </w:p>
+        </w:tc>
       </w:tr>
       <w:tr>
         <w:tc>
           <w:tcPr>
-            <w:tcW w:type="dxa" w:w="2160"/>
+            <w:tcW w:type="dxa" w:w="1728"/>
           </w:tcPr>
           <w:p>
             <w:r>
@@ -411,7 +446,7 @@
         </w:tc>
         <w:tc>
           <w:tcPr>
-            <w:tcW w:type="dxa" w:w="2160"/>
+            <w:tcW w:type="dxa" w:w="1728"/>
           </w:tcPr>
           <w:p>
             <w:r>
@@ -421,7 +456,7 @@
         </w:tc>
         <w:tc>
           <w:tcPr>
-            <w:tcW w:type="dxa" w:w="2160"/>
+            <w:tcW w:type="dxa" w:w="1728"/>
           </w:tcPr>
           <w:p>
             <w:r>
@@ -431,7 +466,7 @@
         </w:tc>
         <w:tc>
           <w:tcPr>
-            <w:tcW w:type="dxa" w:w="2160"/>
+            <w:tcW w:type="dxa" w:w="1728"/>
           </w:tcPr>
           <w:p>
             <w:r>
@@ -439,11 +474,19 @@
             </w:r>
           </w:p>
         </w:tc>
+        <w:tc>
+          <w:tcPr>
+            <w:tcW w:type="dxa" w:w="1728"/>
+          </w:tcPr>
+          <w:p>
+            <w:r/>
+          </w:p>
+        </w:tc>
       </w:tr>
       <w:tr>
         <w:tc>
           <w:tcPr>
-            <w:tcW w:type="dxa" w:w="2160"/>
+            <w:tcW w:type="dxa" w:w="1728"/>
           </w:tcPr>
           <w:p>
             <w:r>
@@ -453,7 +496,7 @@
         </w:tc>
         <w:tc>
           <w:tcPr>
-            <w:tcW w:type="dxa" w:w="2160"/>
+            <w:tcW w:type="dxa" w:w="1728"/>
           </w:tcPr>
           <w:p>
             <w:r>
@@ -463,7 +506,7 @@
         </w:tc>
         <w:tc>
           <w:tcPr>
-            <w:tcW w:type="dxa" w:w="2160"/>
+            <w:tcW w:type="dxa" w:w="1728"/>
           </w:tcPr>
           <w:p>
             <w:r>
@@ -473,7 +516,7 @@
         </w:tc>
         <w:tc>
           <w:tcPr>
-            <w:tcW w:type="dxa" w:w="2160"/>
+            <w:tcW w:type="dxa" w:w="1728"/>
           </w:tcPr>
           <w:p>
             <w:r>
@@ -481,11 +524,19 @@
             </w:r>
           </w:p>
         </w:tc>
+        <w:tc>
+          <w:tcPr>
+            <w:tcW w:type="dxa" w:w="1728"/>
+          </w:tcPr>
+          <w:p>
+            <w:r/>
+          </w:p>
+        </w:tc>
       </w:tr>
       <w:tr>
         <w:tc>
           <w:tcPr>
-            <w:tcW w:type="dxa" w:w="2160"/>
+            <w:tcW w:type="dxa" w:w="1728"/>
           </w:tcPr>
           <w:p>
             <w:r>
@@ -495,7 +546,7 @@
         </w:tc>
         <w:tc>
           <w:tcPr>
-            <w:tcW w:type="dxa" w:w="2160"/>
+            <w:tcW w:type="dxa" w:w="1728"/>
           </w:tcPr>
           <w:p>
             <w:r>
@@ -505,7 +556,7 @@
         </w:tc>
         <w:tc>
           <w:tcPr>
-            <w:tcW w:type="dxa" w:w="2160"/>
+            <w:tcW w:type="dxa" w:w="1728"/>
           </w:tcPr>
           <w:p>
             <w:r>
@@ -515,7 +566,7 @@
         </w:tc>
         <w:tc>
           <w:tcPr>
-            <w:tcW w:type="dxa" w:w="2160"/>
+            <w:tcW w:type="dxa" w:w="1728"/>
           </w:tcPr>
           <w:p>
             <w:r>
@@ -523,11 +574,19 @@
             </w:r>
           </w:p>
         </w:tc>
+        <w:tc>
+          <w:tcPr>
+            <w:tcW w:type="dxa" w:w="1728"/>
+          </w:tcPr>
+          <w:p>
+            <w:r/>
+          </w:p>
+        </w:tc>
       </w:tr>
       <w:tr>
         <w:tc>
           <w:tcPr>
-            <w:tcW w:type="dxa" w:w="2160"/>
+            <w:tcW w:type="dxa" w:w="1728"/>
           </w:tcPr>
           <w:p>
             <w:r>
@@ -537,7 +596,7 @@
         </w:tc>
         <w:tc>
           <w:tcPr>
-            <w:tcW w:type="dxa" w:w="2160"/>
+            <w:tcW w:type="dxa" w:w="1728"/>
           </w:tcPr>
           <w:p>
             <w:r>
@@ -547,7 +606,7 @@
         </w:tc>
         <w:tc>
           <w:tcPr>
-            <w:tcW w:type="dxa" w:w="2160"/>
+            <w:tcW w:type="dxa" w:w="1728"/>
           </w:tcPr>
           <w:p>
             <w:r>
@@ -557,7 +616,7 @@
         </w:tc>
         <w:tc>
           <w:tcPr>
-            <w:tcW w:type="dxa" w:w="2160"/>
+            <w:tcW w:type="dxa" w:w="1728"/>
           </w:tcPr>
           <w:p>
             <w:r>
@@ -565,11 +624,19 @@
             </w:r>
           </w:p>
         </w:tc>
+        <w:tc>
+          <w:tcPr>
+            <w:tcW w:type="dxa" w:w="1728"/>
+          </w:tcPr>
+          <w:p>
+            <w:r/>
+          </w:p>
+        </w:tc>
       </w:tr>
       <w:tr>
         <w:tc>
           <w:tcPr>
-            <w:tcW w:type="dxa" w:w="2160"/>
+            <w:tcW w:type="dxa" w:w="1728"/>
           </w:tcPr>
           <w:p>
             <w:r>
@@ -579,7 +646,7 @@
         </w:tc>
         <w:tc>
           <w:tcPr>
-            <w:tcW w:type="dxa" w:w="2160"/>
+            <w:tcW w:type="dxa" w:w="1728"/>
           </w:tcPr>
           <w:p>
             <w:r>
@@ -589,7 +656,7 @@
         </w:tc>
         <w:tc>
           <w:tcPr>
-            <w:tcW w:type="dxa" w:w="2160"/>
+            <w:tcW w:type="dxa" w:w="1728"/>
           </w:tcPr>
           <w:p>
             <w:r>
@@ -599,7 +666,7 @@
         </w:tc>
         <w:tc>
           <w:tcPr>
-            <w:tcW w:type="dxa" w:w="2160"/>
+            <w:tcW w:type="dxa" w:w="1728"/>
           </w:tcPr>
           <w:p>
             <w:r>
@@ -607,11 +674,19 @@
             </w:r>
           </w:p>
         </w:tc>
+        <w:tc>
+          <w:tcPr>
+            <w:tcW w:type="dxa" w:w="1728"/>
+          </w:tcPr>
+          <w:p>
+            <w:r/>
+          </w:p>
+        </w:tc>
       </w:tr>
       <w:tr>
         <w:tc>
           <w:tcPr>
-            <w:tcW w:type="dxa" w:w="2160"/>
+            <w:tcW w:type="dxa" w:w="1728"/>
           </w:tcPr>
           <w:p>
             <w:r>
@@ -621,7 +696,7 @@
         </w:tc>
         <w:tc>
           <w:tcPr>
-            <w:tcW w:type="dxa" w:w="2160"/>
+            <w:tcW w:type="dxa" w:w="1728"/>
           </w:tcPr>
           <w:p>
             <w:r>
@@ -631,7 +706,7 @@
         </w:tc>
         <w:tc>
           <w:tcPr>
-            <w:tcW w:type="dxa" w:w="2160"/>
+            <w:tcW w:type="dxa" w:w="1728"/>
           </w:tcPr>
           <w:p>
             <w:r>
@@ -641,7 +716,7 @@
         </w:tc>
         <w:tc>
           <w:tcPr>
-            <w:tcW w:type="dxa" w:w="2160"/>
+            <w:tcW w:type="dxa" w:w="1728"/>
           </w:tcPr>
           <w:p>
             <w:r>
@@ -649,11 +724,19 @@
             </w:r>
           </w:p>
         </w:tc>
+        <w:tc>
+          <w:tcPr>
+            <w:tcW w:type="dxa" w:w="1728"/>
+          </w:tcPr>
+          <w:p>
+            <w:r/>
+          </w:p>
+        </w:tc>
       </w:tr>
       <w:tr>
         <w:tc>
           <w:tcPr>
-            <w:tcW w:type="dxa" w:w="2160"/>
+            <w:tcW w:type="dxa" w:w="1728"/>
           </w:tcPr>
           <w:p>
             <w:r>
@@ -663,7 +746,7 @@
         </w:tc>
         <w:tc>
           <w:tcPr>
-            <w:tcW w:type="dxa" w:w="2160"/>
+            <w:tcW w:type="dxa" w:w="1728"/>
           </w:tcPr>
           <w:p>
             <w:r>
@@ -673,7 +756,7 @@
         </w:tc>
         <w:tc>
           <w:tcPr>
-            <w:tcW w:type="dxa" w:w="2160"/>
+            <w:tcW w:type="dxa" w:w="1728"/>
           </w:tcPr>
           <w:p>
             <w:r>
@@ -683,7 +766,7 @@
         </w:tc>
         <w:tc>
           <w:tcPr>
-            <w:tcW w:type="dxa" w:w="2160"/>
+            <w:tcW w:type="dxa" w:w="1728"/>
           </w:tcPr>
           <w:p>
             <w:r>
@@ -691,11 +774,19 @@
             </w:r>
           </w:p>
         </w:tc>
+        <w:tc>
+          <w:tcPr>
+            <w:tcW w:type="dxa" w:w="1728"/>
+          </w:tcPr>
+          <w:p>
+            <w:r/>
+          </w:p>
+        </w:tc>
       </w:tr>
       <w:tr>
         <w:tc>
           <w:tcPr>
-            <w:tcW w:type="dxa" w:w="2160"/>
+            <w:tcW w:type="dxa" w:w="1728"/>
           </w:tcPr>
           <w:p>
             <w:r>
@@ -705,7 +796,7 @@
         </w:tc>
         <w:tc>
           <w:tcPr>
-            <w:tcW w:type="dxa" w:w="2160"/>
+            <w:tcW w:type="dxa" w:w="1728"/>
           </w:tcPr>
           <w:p>
             <w:r>
@@ -715,7 +806,7 @@
         </w:tc>
         <w:tc>
           <w:tcPr>
-            <w:tcW w:type="dxa" w:w="2160"/>
+            <w:tcW w:type="dxa" w:w="1728"/>
           </w:tcPr>
           <w:p>
             <w:r>
@@ -725,7 +816,7 @@
         </w:tc>
         <w:tc>
           <w:tcPr>
-            <w:tcW w:type="dxa" w:w="2160"/>
+            <w:tcW w:type="dxa" w:w="1728"/>
           </w:tcPr>
           <w:p>
             <w:r>
@@ -733,11 +824,19 @@
             </w:r>
           </w:p>
         </w:tc>
+        <w:tc>
+          <w:tcPr>
+            <w:tcW w:type="dxa" w:w="1728"/>
+          </w:tcPr>
+          <w:p>
+            <w:r/>
+          </w:p>
+        </w:tc>
       </w:tr>
       <w:tr>
         <w:tc>
           <w:tcPr>
-            <w:tcW w:type="dxa" w:w="2160"/>
+            <w:tcW w:type="dxa" w:w="1728"/>
           </w:tcPr>
           <w:p>
             <w:r>
@@ -747,7 +846,7 @@
         </w:tc>
         <w:tc>
           <w:tcPr>
-            <w:tcW w:type="dxa" w:w="2160"/>
+            <w:tcW w:type="dxa" w:w="1728"/>
           </w:tcPr>
           <w:p>
             <w:r>
@@ -757,7 +856,7 @@
         </w:tc>
         <w:tc>
           <w:tcPr>
-            <w:tcW w:type="dxa" w:w="2160"/>
+            <w:tcW w:type="dxa" w:w="1728"/>
           </w:tcPr>
           <w:p>
             <w:r>
@@ -767,7 +866,7 @@
         </w:tc>
         <w:tc>
           <w:tcPr>
-            <w:tcW w:type="dxa" w:w="2160"/>
+            <w:tcW w:type="dxa" w:w="1728"/>
           </w:tcPr>
           <w:p>
             <w:r>
@@ -775,11 +874,19 @@
             </w:r>
           </w:p>
         </w:tc>
+        <w:tc>
+          <w:tcPr>
+            <w:tcW w:type="dxa" w:w="1728"/>
+          </w:tcPr>
+          <w:p>
+            <w:r/>
+          </w:p>
+        </w:tc>
       </w:tr>
       <w:tr>
         <w:tc>
           <w:tcPr>
-            <w:tcW w:type="dxa" w:w="2160"/>
+            <w:tcW w:type="dxa" w:w="1728"/>
           </w:tcPr>
           <w:p>
             <w:r>
@@ -789,7 +896,7 @@
         </w:tc>
         <w:tc>
           <w:tcPr>
-            <w:tcW w:type="dxa" w:w="2160"/>
+            <w:tcW w:type="dxa" w:w="1728"/>
           </w:tcPr>
           <w:p>
             <w:r>
@@ -799,7 +906,7 @@
         </w:tc>
         <w:tc>
           <w:tcPr>
-            <w:tcW w:type="dxa" w:w="2160"/>
+            <w:tcW w:type="dxa" w:w="1728"/>
           </w:tcPr>
           <w:p>
             <w:r>
@@ -809,7 +916,7 @@
         </w:tc>
         <w:tc>
           <w:tcPr>
-            <w:tcW w:type="dxa" w:w="2160"/>
+            <w:tcW w:type="dxa" w:w="1728"/>
           </w:tcPr>
           <w:p>
             <w:r>
@@ -817,11 +924,19 @@
             </w:r>
           </w:p>
         </w:tc>
+        <w:tc>
+          <w:tcPr>
+            <w:tcW w:type="dxa" w:w="1728"/>
+          </w:tcPr>
+          <w:p>
+            <w:r/>
+          </w:p>
+        </w:tc>
       </w:tr>
       <w:tr>
         <w:tc>
           <w:tcPr>
-            <w:tcW w:type="dxa" w:w="2160"/>
+            <w:tcW w:type="dxa" w:w="1728"/>
           </w:tcPr>
           <w:p>
             <w:r>
@@ -831,7 +946,7 @@
         </w:tc>
         <w:tc>
           <w:tcPr>
-            <w:tcW w:type="dxa" w:w="2160"/>
+            <w:tcW w:type="dxa" w:w="1728"/>
           </w:tcPr>
           <w:p>
             <w:r>
@@ -841,7 +956,7 @@
         </w:tc>
         <w:tc>
           <w:tcPr>
-            <w:tcW w:type="dxa" w:w="2160"/>
+            <w:tcW w:type="dxa" w:w="1728"/>
           </w:tcPr>
           <w:p>
             <w:r>
@@ -851,7 +966,7 @@
         </w:tc>
         <w:tc>
           <w:tcPr>
-            <w:tcW w:type="dxa" w:w="2160"/>
+            <w:tcW w:type="dxa" w:w="1728"/>
           </w:tcPr>
           <w:p>
             <w:r>
@@ -859,11 +974,19 @@
             </w:r>
           </w:p>
         </w:tc>
+        <w:tc>
+          <w:tcPr>
+            <w:tcW w:type="dxa" w:w="1728"/>
+          </w:tcPr>
+          <w:p>
+            <w:r/>
+          </w:p>
+        </w:tc>
       </w:tr>
       <w:tr>
         <w:tc>
           <w:tcPr>
-            <w:tcW w:type="dxa" w:w="2160"/>
+            <w:tcW w:type="dxa" w:w="1728"/>
           </w:tcPr>
           <w:p>
             <w:r>
@@ -873,7 +996,7 @@
         </w:tc>
         <w:tc>
           <w:tcPr>
-            <w:tcW w:type="dxa" w:w="2160"/>
+            <w:tcW w:type="dxa" w:w="1728"/>
           </w:tcPr>
           <w:p>
             <w:r>
@@ -883,7 +1006,7 @@
         </w:tc>
         <w:tc>
           <w:tcPr>
-            <w:tcW w:type="dxa" w:w="2160"/>
+            <w:tcW w:type="dxa" w:w="1728"/>
           </w:tcPr>
           <w:p>
             <w:r>
@@ -893,7 +1016,7 @@
         </w:tc>
         <w:tc>
           <w:tcPr>
-            <w:tcW w:type="dxa" w:w="2160"/>
+            <w:tcW w:type="dxa" w:w="1728"/>
           </w:tcPr>
           <w:p>
             <w:r>
@@ -901,11 +1024,19 @@
             </w:r>
           </w:p>
         </w:tc>
+        <w:tc>
+          <w:tcPr>
+            <w:tcW w:type="dxa" w:w="1728"/>
+          </w:tcPr>
+          <w:p>
+            <w:r/>
+          </w:p>
+        </w:tc>
       </w:tr>
       <w:tr>
         <w:tc>
           <w:tcPr>
-            <w:tcW w:type="dxa" w:w="2160"/>
+            <w:tcW w:type="dxa" w:w="1728"/>
           </w:tcPr>
           <w:p>
             <w:r>
@@ -915,7 +1046,7 @@
         </w:tc>
         <w:tc>
           <w:tcPr>
-            <w:tcW w:type="dxa" w:w="2160"/>
+            <w:tcW w:type="dxa" w:w="1728"/>
           </w:tcPr>
           <w:p>
             <w:r>
@@ -925,7 +1056,7 @@
         </w:tc>
         <w:tc>
           <w:tcPr>
-            <w:tcW w:type="dxa" w:w="2160"/>
+            <w:tcW w:type="dxa" w:w="1728"/>
           </w:tcPr>
           <w:p>
             <w:r>
@@ -935,7 +1066,7 @@
         </w:tc>
         <w:tc>
           <w:tcPr>
-            <w:tcW w:type="dxa" w:w="2160"/>
+            <w:tcW w:type="dxa" w:w="1728"/>
           </w:tcPr>
           <w:p>
             <w:r>
@@ -943,11 +1074,19 @@
             </w:r>
           </w:p>
         </w:tc>
+        <w:tc>
+          <w:tcPr>
+            <w:tcW w:type="dxa" w:w="1728"/>
+          </w:tcPr>
+          <w:p>
+            <w:r/>
+          </w:p>
+        </w:tc>
       </w:tr>
       <w:tr>
         <w:tc>
           <w:tcPr>
-            <w:tcW w:type="dxa" w:w="2160"/>
+            <w:tcW w:type="dxa" w:w="1728"/>
           </w:tcPr>
           <w:p>
             <w:r>
@@ -957,7 +1096,7 @@
         </w:tc>
         <w:tc>
           <w:tcPr>
-            <w:tcW w:type="dxa" w:w="2160"/>
+            <w:tcW w:type="dxa" w:w="1728"/>
           </w:tcPr>
           <w:p>
             <w:r>
@@ -967,7 +1106,7 @@
         </w:tc>
         <w:tc>
           <w:tcPr>
-            <w:tcW w:type="dxa" w:w="2160"/>
+            <w:tcW w:type="dxa" w:w="1728"/>
           </w:tcPr>
           <w:p>
             <w:r>
@@ -977,7 +1116,7 @@
         </w:tc>
         <w:tc>
           <w:tcPr>
-            <w:tcW w:type="dxa" w:w="2160"/>
+            <w:tcW w:type="dxa" w:w="1728"/>
           </w:tcPr>
           <w:p>
             <w:r>
@@ -985,11 +1124,19 @@
             </w:r>
           </w:p>
         </w:tc>
+        <w:tc>
+          <w:tcPr>
+            <w:tcW w:type="dxa" w:w="1728"/>
+          </w:tcPr>
+          <w:p>
+            <w:r/>
+          </w:p>
+        </w:tc>
       </w:tr>
       <w:tr>
         <w:tc>
           <w:tcPr>
-            <w:tcW w:type="dxa" w:w="2160"/>
+            <w:tcW w:type="dxa" w:w="1728"/>
           </w:tcPr>
           <w:p>
             <w:r>
@@ -999,7 +1146,7 @@
         </w:tc>
         <w:tc>
           <w:tcPr>
-            <w:tcW w:type="dxa" w:w="2160"/>
+            <w:tcW w:type="dxa" w:w="1728"/>
           </w:tcPr>
           <w:p>
             <w:r>
@@ -1009,7 +1156,7 @@
         </w:tc>
         <w:tc>
           <w:tcPr>
-            <w:tcW w:type="dxa" w:w="2160"/>
+            <w:tcW w:type="dxa" w:w="1728"/>
           </w:tcPr>
           <w:p>
             <w:r>
@@ -1019,7 +1166,7 @@
         </w:tc>
         <w:tc>
           <w:tcPr>
-            <w:tcW w:type="dxa" w:w="2160"/>
+            <w:tcW w:type="dxa" w:w="1728"/>
           </w:tcPr>
           <w:p>
             <w:r>
@@ -1027,11 +1174,19 @@
             </w:r>
           </w:p>
         </w:tc>
+        <w:tc>
+          <w:tcPr>
+            <w:tcW w:type="dxa" w:w="1728"/>
+          </w:tcPr>
+          <w:p>
+            <w:r/>
+          </w:p>
+        </w:tc>
       </w:tr>
       <w:tr>
         <w:tc>
           <w:tcPr>
-            <w:tcW w:type="dxa" w:w="2160"/>
+            <w:tcW w:type="dxa" w:w="1728"/>
           </w:tcPr>
           <w:p>
             <w:r>
@@ -1041,7 +1196,7 @@
         </w:tc>
         <w:tc>
           <w:tcPr>
-            <w:tcW w:type="dxa" w:w="2160"/>
+            <w:tcW w:type="dxa" w:w="1728"/>
           </w:tcPr>
           <w:p>
             <w:r>
@@ -1051,7 +1206,7 @@
         </w:tc>
         <w:tc>
           <w:tcPr>
-            <w:tcW w:type="dxa" w:w="2160"/>
+            <w:tcW w:type="dxa" w:w="1728"/>
           </w:tcPr>
           <w:p>
             <w:r>
@@ -1061,7 +1216,7 @@
         </w:tc>
         <w:tc>
           <w:tcPr>
-            <w:tcW w:type="dxa" w:w="2160"/>
+            <w:tcW w:type="dxa" w:w="1728"/>
           </w:tcPr>
           <w:p>
             <w:r>
@@ -1069,11 +1224,19 @@
             </w:r>
           </w:p>
         </w:tc>
+        <w:tc>
+          <w:tcPr>
+            <w:tcW w:type="dxa" w:w="1728"/>
+          </w:tcPr>
+          <w:p>
+            <w:r/>
+          </w:p>
+        </w:tc>
       </w:tr>
       <w:tr>
         <w:tc>
           <w:tcPr>
-            <w:tcW w:type="dxa" w:w="2160"/>
+            <w:tcW w:type="dxa" w:w="1728"/>
           </w:tcPr>
           <w:p>
             <w:r>
@@ -1083,7 +1246,7 @@
         </w:tc>
         <w:tc>
           <w:tcPr>
-            <w:tcW w:type="dxa" w:w="2160"/>
+            <w:tcW w:type="dxa" w:w="1728"/>
           </w:tcPr>
           <w:p>
             <w:r>
@@ -1093,7 +1256,7 @@
         </w:tc>
         <w:tc>
           <w:tcPr>
-            <w:tcW w:type="dxa" w:w="2160"/>
+            <w:tcW w:type="dxa" w:w="1728"/>
           </w:tcPr>
           <w:p>
             <w:r>
@@ -1103,7 +1266,7 @@
         </w:tc>
         <w:tc>
           <w:tcPr>
-            <w:tcW w:type="dxa" w:w="2160"/>
+            <w:tcW w:type="dxa" w:w="1728"/>
           </w:tcPr>
           <w:p>
             <w:r>
@@ -1111,11 +1274,19 @@
             </w:r>
           </w:p>
         </w:tc>
+        <w:tc>
+          <w:tcPr>
+            <w:tcW w:type="dxa" w:w="1728"/>
+          </w:tcPr>
+          <w:p>
+            <w:r/>
+          </w:p>
+        </w:tc>
       </w:tr>
       <w:tr>
         <w:tc>
           <w:tcPr>
-            <w:tcW w:type="dxa" w:w="2160"/>
+            <w:tcW w:type="dxa" w:w="1728"/>
           </w:tcPr>
           <w:p>
             <w:r>
@@ -1125,7 +1296,7 @@
         </w:tc>
         <w:tc>
           <w:tcPr>
-            <w:tcW w:type="dxa" w:w="2160"/>
+            <w:tcW w:type="dxa" w:w="1728"/>
           </w:tcPr>
           <w:p>
             <w:r>
@@ -1135,7 +1306,7 @@
         </w:tc>
         <w:tc>
           <w:tcPr>
-            <w:tcW w:type="dxa" w:w="2160"/>
+            <w:tcW w:type="dxa" w:w="1728"/>
           </w:tcPr>
           <w:p>
             <w:r>
@@ -1145,7 +1316,7 @@
         </w:tc>
         <w:tc>
           <w:tcPr>
-            <w:tcW w:type="dxa" w:w="2160"/>
+            <w:tcW w:type="dxa" w:w="1728"/>
           </w:tcPr>
           <w:p>
             <w:r>
@@ -1153,11 +1324,19 @@
             </w:r>
           </w:p>
         </w:tc>
+        <w:tc>
+          <w:tcPr>
+            <w:tcW w:type="dxa" w:w="1728"/>
+          </w:tcPr>
+          <w:p>
+            <w:r/>
+          </w:p>
+        </w:tc>
       </w:tr>
       <w:tr>
         <w:tc>
           <w:tcPr>
-            <w:tcW w:type="dxa" w:w="2160"/>
+            <w:tcW w:type="dxa" w:w="1728"/>
           </w:tcPr>
           <w:p>
             <w:r>
@@ -1167,7 +1346,7 @@
         </w:tc>
         <w:tc>
           <w:tcPr>
-            <w:tcW w:type="dxa" w:w="2160"/>
+            <w:tcW w:type="dxa" w:w="1728"/>
           </w:tcPr>
           <w:p>
             <w:r>
@@ -1177,7 +1356,7 @@
         </w:tc>
         <w:tc>
           <w:tcPr>
-            <w:tcW w:type="dxa" w:w="2160"/>
+            <w:tcW w:type="dxa" w:w="1728"/>
           </w:tcPr>
           <w:p>
             <w:r>
@@ -1187,7 +1366,7 @@
         </w:tc>
         <w:tc>
           <w:tcPr>
-            <w:tcW w:type="dxa" w:w="2160"/>
+            <w:tcW w:type="dxa" w:w="1728"/>
           </w:tcPr>
           <w:p>
             <w:r>
@@ -1195,11 +1374,19 @@
             </w:r>
           </w:p>
         </w:tc>
+        <w:tc>
+          <w:tcPr>
+            <w:tcW w:type="dxa" w:w="1728"/>
+          </w:tcPr>
+          <w:p>
+            <w:r/>
+          </w:p>
+        </w:tc>
       </w:tr>
       <w:tr>
         <w:tc>
           <w:tcPr>
-            <w:tcW w:type="dxa" w:w="2160"/>
+            <w:tcW w:type="dxa" w:w="1728"/>
           </w:tcPr>
           <w:p>
             <w:r>
@@ -1209,7 +1396,7 @@
         </w:tc>
         <w:tc>
           <w:tcPr>
-            <w:tcW w:type="dxa" w:w="2160"/>
+            <w:tcW w:type="dxa" w:w="1728"/>
           </w:tcPr>
           <w:p>
             <w:r>
@@ -1219,7 +1406,7 @@
         </w:tc>
         <w:tc>
           <w:tcPr>
-            <w:tcW w:type="dxa" w:w="2160"/>
+            <w:tcW w:type="dxa" w:w="1728"/>
           </w:tcPr>
           <w:p>
             <w:r>
@@ -1229,7 +1416,7 @@
         </w:tc>
         <w:tc>
           <w:tcPr>
-            <w:tcW w:type="dxa" w:w="2160"/>
+            <w:tcW w:type="dxa" w:w="1728"/>
           </w:tcPr>
           <w:p>
             <w:r>
@@ -1237,11 +1424,19 @@
             </w:r>
           </w:p>
         </w:tc>
+        <w:tc>
+          <w:tcPr>
+            <w:tcW w:type="dxa" w:w="1728"/>
+          </w:tcPr>
+          <w:p>
+            <w:r/>
+          </w:p>
+        </w:tc>
       </w:tr>
       <w:tr>
         <w:tc>
           <w:tcPr>
-            <w:tcW w:type="dxa" w:w="2160"/>
+            <w:tcW w:type="dxa" w:w="1728"/>
           </w:tcPr>
           <w:p>
             <w:r>
@@ -1251,7 +1446,7 @@
         </w:tc>
         <w:tc>
           <w:tcPr>
-            <w:tcW w:type="dxa" w:w="2160"/>
+            <w:tcW w:type="dxa" w:w="1728"/>
           </w:tcPr>
           <w:p>
             <w:r>
@@ -1261,7 +1456,7 @@
         </w:tc>
         <w:tc>
           <w:tcPr>
-            <w:tcW w:type="dxa" w:w="2160"/>
+            <w:tcW w:type="dxa" w:w="1728"/>
           </w:tcPr>
           <w:p>
             <w:r>
@@ -1271,7 +1466,7 @@
         </w:tc>
         <w:tc>
           <w:tcPr>
-            <w:tcW w:type="dxa" w:w="2160"/>
+            <w:tcW w:type="dxa" w:w="1728"/>
           </w:tcPr>
           <w:p>
             <w:r>
@@ -1279,11 +1474,19 @@
             </w:r>
           </w:p>
         </w:tc>
+        <w:tc>
+          <w:tcPr>
+            <w:tcW w:type="dxa" w:w="1728"/>
+          </w:tcPr>
+          <w:p>
+            <w:r/>
+          </w:p>
+        </w:tc>
       </w:tr>
       <w:tr>
         <w:tc>
           <w:tcPr>
-            <w:tcW w:type="dxa" w:w="2160"/>
+            <w:tcW w:type="dxa" w:w="1728"/>
           </w:tcPr>
           <w:p>
             <w:r>
@@ -1293,7 +1496,7 @@
         </w:tc>
         <w:tc>
           <w:tcPr>
-            <w:tcW w:type="dxa" w:w="2160"/>
+            <w:tcW w:type="dxa" w:w="1728"/>
           </w:tcPr>
           <w:p>
             <w:r>
@@ -1303,7 +1506,7 @@
         </w:tc>
         <w:tc>
           <w:tcPr>
-            <w:tcW w:type="dxa" w:w="2160"/>
+            <w:tcW w:type="dxa" w:w="1728"/>
           </w:tcPr>
           <w:p>
             <w:r>
@@ -1313,7 +1516,7 @@
         </w:tc>
         <w:tc>
           <w:tcPr>
-            <w:tcW w:type="dxa" w:w="2160"/>
+            <w:tcW w:type="dxa" w:w="1728"/>
           </w:tcPr>
           <w:p>
             <w:r>
@@ -1321,11 +1524,19 @@
             </w:r>
           </w:p>
         </w:tc>
+        <w:tc>
+          <w:tcPr>
+            <w:tcW w:type="dxa" w:w="1728"/>
+          </w:tcPr>
+          <w:p>
+            <w:r/>
+          </w:p>
+        </w:tc>
       </w:tr>
       <w:tr>
         <w:tc>
           <w:tcPr>
-            <w:tcW w:type="dxa" w:w="2160"/>
+            <w:tcW w:type="dxa" w:w="1728"/>
           </w:tcPr>
           <w:p>
             <w:r>
@@ -1335,7 +1546,7 @@
         </w:tc>
         <w:tc>
           <w:tcPr>
-            <w:tcW w:type="dxa" w:w="2160"/>
+            <w:tcW w:type="dxa" w:w="1728"/>
           </w:tcPr>
           <w:p>
             <w:r>
@@ -1345,7 +1556,7 @@
         </w:tc>
         <w:tc>
           <w:tcPr>
-            <w:tcW w:type="dxa" w:w="2160"/>
+            <w:tcW w:type="dxa" w:w="1728"/>
           </w:tcPr>
           <w:p>
             <w:r>
@@ -1355,7 +1566,7 @@
         </w:tc>
         <w:tc>
           <w:tcPr>
-            <w:tcW w:type="dxa" w:w="2160"/>
+            <w:tcW w:type="dxa" w:w="1728"/>
           </w:tcPr>
           <w:p>
             <w:r>
@@ -1363,11 +1574,19 @@
             </w:r>
           </w:p>
         </w:tc>
+        <w:tc>
+          <w:tcPr>
+            <w:tcW w:type="dxa" w:w="1728"/>
+          </w:tcPr>
+          <w:p>
+            <w:r/>
+          </w:p>
+        </w:tc>
       </w:tr>
       <w:tr>
         <w:tc>
           <w:tcPr>
-            <w:tcW w:type="dxa" w:w="2160"/>
+            <w:tcW w:type="dxa" w:w="1728"/>
           </w:tcPr>
           <w:p>
             <w:r>
@@ -1377,7 +1596,7 @@
         </w:tc>
         <w:tc>
           <w:tcPr>
-            <w:tcW w:type="dxa" w:w="2160"/>
+            <w:tcW w:type="dxa" w:w="1728"/>
           </w:tcPr>
           <w:p>
             <w:r>
@@ -1387,7 +1606,7 @@
         </w:tc>
         <w:tc>
           <w:tcPr>
-            <w:tcW w:type="dxa" w:w="2160"/>
+            <w:tcW w:type="dxa" w:w="1728"/>
           </w:tcPr>
           <w:p>
             <w:r>
@@ -1397,7 +1616,7 @@
         </w:tc>
         <w:tc>
           <w:tcPr>
-            <w:tcW w:type="dxa" w:w="2160"/>
+            <w:tcW w:type="dxa" w:w="1728"/>
           </w:tcPr>
           <w:p>
             <w:r>
@@ -1405,11 +1624,19 @@
             </w:r>
           </w:p>
         </w:tc>
+        <w:tc>
+          <w:tcPr>
+            <w:tcW w:type="dxa" w:w="1728"/>
+          </w:tcPr>
+          <w:p>
+            <w:r/>
+          </w:p>
+        </w:tc>
       </w:tr>
       <w:tr>
         <w:tc>
           <w:tcPr>
-            <w:tcW w:type="dxa" w:w="2160"/>
+            <w:tcW w:type="dxa" w:w="1728"/>
           </w:tcPr>
           <w:p>
             <w:r>
@@ -1419,7 +1646,7 @@
         </w:tc>
         <w:tc>
           <w:tcPr>
-            <w:tcW w:type="dxa" w:w="2160"/>
+            <w:tcW w:type="dxa" w:w="1728"/>
           </w:tcPr>
           <w:p>
             <w:r>
@@ -1429,7 +1656,7 @@
         </w:tc>
         <w:tc>
           <w:tcPr>
-            <w:tcW w:type="dxa" w:w="2160"/>
+            <w:tcW w:type="dxa" w:w="1728"/>
           </w:tcPr>
           <w:p>
             <w:r>
@@ -1439,7 +1666,7 @@
         </w:tc>
         <w:tc>
           <w:tcPr>
-            <w:tcW w:type="dxa" w:w="2160"/>
+            <w:tcW w:type="dxa" w:w="1728"/>
           </w:tcPr>
           <w:p>
             <w:r>
@@ -1447,11 +1674,19 @@
             </w:r>
           </w:p>
         </w:tc>
+        <w:tc>
+          <w:tcPr>
+            <w:tcW w:type="dxa" w:w="1728"/>
+          </w:tcPr>
+          <w:p>
+            <w:r/>
+          </w:p>
+        </w:tc>
       </w:tr>
       <w:tr>
         <w:tc>
           <w:tcPr>
-            <w:tcW w:type="dxa" w:w="2160"/>
+            <w:tcW w:type="dxa" w:w="1728"/>
           </w:tcPr>
           <w:p>
             <w:r>
@@ -1461,7 +1696,7 @@
         </w:tc>
         <w:tc>
           <w:tcPr>
-            <w:tcW w:type="dxa" w:w="2160"/>
+            <w:tcW w:type="dxa" w:w="1728"/>
           </w:tcPr>
           <w:p>
             <w:r>
@@ -1471,7 +1706,7 @@
         </w:tc>
         <w:tc>
           <w:tcPr>
-            <w:tcW w:type="dxa" w:w="2160"/>
+            <w:tcW w:type="dxa" w:w="1728"/>
           </w:tcPr>
           <w:p>
             <w:r>
@@ -1481,7 +1716,7 @@
         </w:tc>
         <w:tc>
           <w:tcPr>
-            <w:tcW w:type="dxa" w:w="2160"/>
+            <w:tcW w:type="dxa" w:w="1728"/>
           </w:tcPr>
           <w:p>
             <w:r>
@@ -1489,11 +1724,19 @@
             </w:r>
           </w:p>
         </w:tc>
+        <w:tc>
+          <w:tcPr>
+            <w:tcW w:type="dxa" w:w="1728"/>
+          </w:tcPr>
+          <w:p>
+            <w:r/>
+          </w:p>
+        </w:tc>
       </w:tr>
       <w:tr>
         <w:tc>
           <w:tcPr>
-            <w:tcW w:type="dxa" w:w="2160"/>
+            <w:tcW w:type="dxa" w:w="1728"/>
           </w:tcPr>
           <w:p>
             <w:r>
@@ -1503,7 +1746,7 @@
         </w:tc>
         <w:tc>
           <w:tcPr>
-            <w:tcW w:type="dxa" w:w="2160"/>
+            <w:tcW w:type="dxa" w:w="1728"/>
           </w:tcPr>
           <w:p>
             <w:r>
@@ -1513,7 +1756,7 @@
         </w:tc>
         <w:tc>
           <w:tcPr>
-            <w:tcW w:type="dxa" w:w="2160"/>
+            <w:tcW w:type="dxa" w:w="1728"/>
           </w:tcPr>
           <w:p>
             <w:r>
@@ -1523,7 +1766,7 @@
         </w:tc>
         <w:tc>
           <w:tcPr>
-            <w:tcW w:type="dxa" w:w="2160"/>
+            <w:tcW w:type="dxa" w:w="1728"/>
           </w:tcPr>
           <w:p>
             <w:r>
@@ -1531,11 +1774,19 @@
             </w:r>
           </w:p>
         </w:tc>
+        <w:tc>
+          <w:tcPr>
+            <w:tcW w:type="dxa" w:w="1728"/>
+          </w:tcPr>
+          <w:p>
+            <w:r/>
+          </w:p>
+        </w:tc>
       </w:tr>
       <w:tr>
         <w:tc>
           <w:tcPr>
-            <w:tcW w:type="dxa" w:w="2160"/>
+            <w:tcW w:type="dxa" w:w="1728"/>
           </w:tcPr>
           <w:p>
             <w:r>
@@ -1545,7 +1796,7 @@
         </w:tc>
         <w:tc>
           <w:tcPr>
-            <w:tcW w:type="dxa" w:w="2160"/>
+            <w:tcW w:type="dxa" w:w="1728"/>
           </w:tcPr>
           <w:p>
             <w:r>
@@ -1555,7 +1806,7 @@
         </w:tc>
         <w:tc>
           <w:tcPr>
-            <w:tcW w:type="dxa" w:w="2160"/>
+            <w:tcW w:type="dxa" w:w="1728"/>
           </w:tcPr>
           <w:p>
             <w:r>
@@ -1565,7 +1816,7 @@
         </w:tc>
         <w:tc>
           <w:tcPr>
-            <w:tcW w:type="dxa" w:w="2160"/>
+            <w:tcW w:type="dxa" w:w="1728"/>
           </w:tcPr>
           <w:p>
             <w:r>
@@ -1573,11 +1824,19 @@
             </w:r>
           </w:p>
         </w:tc>
+        <w:tc>
+          <w:tcPr>
+            <w:tcW w:type="dxa" w:w="1728"/>
+          </w:tcPr>
+          <w:p>
+            <w:r/>
+          </w:p>
+        </w:tc>
       </w:tr>
       <w:tr>
         <w:tc>
           <w:tcPr>
-            <w:tcW w:type="dxa" w:w="2160"/>
+            <w:tcW w:type="dxa" w:w="1728"/>
           </w:tcPr>
           <w:p>
             <w:r>
@@ -1587,7 +1846,7 @@
         </w:tc>
         <w:tc>
           <w:tcPr>
-            <w:tcW w:type="dxa" w:w="2160"/>
+            <w:tcW w:type="dxa" w:w="1728"/>
           </w:tcPr>
           <w:p>
             <w:r>
@@ -1597,7 +1856,7 @@
         </w:tc>
         <w:tc>
           <w:tcPr>
-            <w:tcW w:type="dxa" w:w="2160"/>
+            <w:tcW w:type="dxa" w:w="1728"/>
           </w:tcPr>
           <w:p>
             <w:r>
@@ -1607,7 +1866,7 @@
         </w:tc>
         <w:tc>
           <w:tcPr>
-            <w:tcW w:type="dxa" w:w="2160"/>
+            <w:tcW w:type="dxa" w:w="1728"/>
           </w:tcPr>
           <w:p>
             <w:r>
@@ -1615,11 +1874,19 @@
             </w:r>
           </w:p>
         </w:tc>
+        <w:tc>
+          <w:tcPr>
+            <w:tcW w:type="dxa" w:w="1728"/>
+          </w:tcPr>
+          <w:p>
+            <w:r/>
+          </w:p>
+        </w:tc>
       </w:tr>
       <w:tr>
         <w:tc>
           <w:tcPr>
-            <w:tcW w:type="dxa" w:w="2160"/>
+            <w:tcW w:type="dxa" w:w="1728"/>
           </w:tcPr>
           <w:p>
             <w:r>
@@ -1629,7 +1896,7 @@
         </w:tc>
         <w:tc>
           <w:tcPr>
-            <w:tcW w:type="dxa" w:w="2160"/>
+            <w:tcW w:type="dxa" w:w="1728"/>
           </w:tcPr>
           <w:p>
             <w:r>
@@ -1639,7 +1906,7 @@
         </w:tc>
         <w:tc>
           <w:tcPr>
-            <w:tcW w:type="dxa" w:w="2160"/>
+            <w:tcW w:type="dxa" w:w="1728"/>
           </w:tcPr>
           <w:p>
             <w:r>
@@ -1649,7 +1916,7 @@
         </w:tc>
         <w:tc>
           <w:tcPr>
-            <w:tcW w:type="dxa" w:w="2160"/>
+            <w:tcW w:type="dxa" w:w="1728"/>
           </w:tcPr>
           <w:p>
             <w:r>
@@ -1657,11 +1924,19 @@
             </w:r>
           </w:p>
         </w:tc>
+        <w:tc>
+          <w:tcPr>
+            <w:tcW w:type="dxa" w:w="1728"/>
+          </w:tcPr>
+          <w:p>
+            <w:r/>
+          </w:p>
+        </w:tc>
       </w:tr>
       <w:tr>
         <w:tc>
           <w:tcPr>
-            <w:tcW w:type="dxa" w:w="2160"/>
+            <w:tcW w:type="dxa" w:w="1728"/>
           </w:tcPr>
           <w:p>
             <w:r>
@@ -1671,7 +1946,7 @@
         </w:tc>
         <w:tc>
           <w:tcPr>
-            <w:tcW w:type="dxa" w:w="2160"/>
+            <w:tcW w:type="dxa" w:w="1728"/>
           </w:tcPr>
           <w:p>
             <w:r>
@@ -1681,7 +1956,7 @@
         </w:tc>
         <w:tc>
           <w:tcPr>
-            <w:tcW w:type="dxa" w:w="2160"/>
+            <w:tcW w:type="dxa" w:w="1728"/>
           </w:tcPr>
           <w:p>
             <w:r>
@@ -1691,7 +1966,7 @@
         </w:tc>
         <w:tc>
           <w:tcPr>
-            <w:tcW w:type="dxa" w:w="2160"/>
+            <w:tcW w:type="dxa" w:w="1728"/>
           </w:tcPr>
           <w:p>
             <w:r>
@@ -1699,11 +1974,19 @@
             </w:r>
           </w:p>
         </w:tc>
+        <w:tc>
+          <w:tcPr>
+            <w:tcW w:type="dxa" w:w="1728"/>
+          </w:tcPr>
+          <w:p>
+            <w:r/>
+          </w:p>
+        </w:tc>
       </w:tr>
       <w:tr>
         <w:tc>
           <w:tcPr>
-            <w:tcW w:type="dxa" w:w="2160"/>
+            <w:tcW w:type="dxa" w:w="1728"/>
           </w:tcPr>
           <w:p>
             <w:r>
@@ -1713,7 +1996,7 @@
         </w:tc>
         <w:tc>
           <w:tcPr>
-            <w:tcW w:type="dxa" w:w="2160"/>
+            <w:tcW w:type="dxa" w:w="1728"/>
           </w:tcPr>
           <w:p>
             <w:r>
@@ -1723,7 +2006,7 @@
         </w:tc>
         <w:tc>
           <w:tcPr>
-            <w:tcW w:type="dxa" w:w="2160"/>
+            <w:tcW w:type="dxa" w:w="1728"/>
           </w:tcPr>
           <w:p>
             <w:r>
@@ -1733,7 +2016,7 @@
         </w:tc>
         <w:tc>
           <w:tcPr>
-            <w:tcW w:type="dxa" w:w="2160"/>
+            <w:tcW w:type="dxa" w:w="1728"/>
           </w:tcPr>
           <w:p>
             <w:r>
@@ -1741,11 +2024,19 @@
             </w:r>
           </w:p>
         </w:tc>
+        <w:tc>
+          <w:tcPr>
+            <w:tcW w:type="dxa" w:w="1728"/>
+          </w:tcPr>
+          <w:p>
+            <w:r/>
+          </w:p>
+        </w:tc>
       </w:tr>
       <w:tr>
         <w:tc>
           <w:tcPr>
-            <w:tcW w:type="dxa" w:w="2160"/>
+            <w:tcW w:type="dxa" w:w="1728"/>
           </w:tcPr>
           <w:p>
             <w:r>
@@ -1755,7 +2046,7 @@
         </w:tc>
         <w:tc>
           <w:tcPr>
-            <w:tcW w:type="dxa" w:w="2160"/>
+            <w:tcW w:type="dxa" w:w="1728"/>
           </w:tcPr>
           <w:p>
             <w:r>
@@ -1765,7 +2056,7 @@
         </w:tc>
         <w:tc>
           <w:tcPr>
-            <w:tcW w:type="dxa" w:w="2160"/>
+            <w:tcW w:type="dxa" w:w="1728"/>
           </w:tcPr>
           <w:p>
             <w:r>
@@ -1775,7 +2066,7 @@
         </w:tc>
         <w:tc>
           <w:tcPr>
-            <w:tcW w:type="dxa" w:w="2160"/>
+            <w:tcW w:type="dxa" w:w="1728"/>
           </w:tcPr>
           <w:p>
             <w:r>
@@ -1783,11 +2074,19 @@
             </w:r>
           </w:p>
         </w:tc>
+        <w:tc>
+          <w:tcPr>
+            <w:tcW w:type="dxa" w:w="1728"/>
+          </w:tcPr>
+          <w:p>
+            <w:r/>
+          </w:p>
+        </w:tc>
       </w:tr>
       <w:tr>
         <w:tc>
           <w:tcPr>
-            <w:tcW w:type="dxa" w:w="2160"/>
+            <w:tcW w:type="dxa" w:w="1728"/>
           </w:tcPr>
           <w:p>
             <w:r>
@@ -1797,7 +2096,7 @@
         </w:tc>
         <w:tc>
           <w:tcPr>
-            <w:tcW w:type="dxa" w:w="2160"/>
+            <w:tcW w:type="dxa" w:w="1728"/>
           </w:tcPr>
           <w:p>
             <w:r>
@@ -1807,7 +2106,7 @@
         </w:tc>
         <w:tc>
           <w:tcPr>
-            <w:tcW w:type="dxa" w:w="2160"/>
+            <w:tcW w:type="dxa" w:w="1728"/>
           </w:tcPr>
           <w:p>
             <w:r>
@@ -1817,7 +2116,7 @@
         </w:tc>
         <w:tc>
           <w:tcPr>
-            <w:tcW w:type="dxa" w:w="2160"/>
+            <w:tcW w:type="dxa" w:w="1728"/>
           </w:tcPr>
           <w:p>
             <w:r>
@@ -1825,11 +2124,19 @@
             </w:r>
           </w:p>
         </w:tc>
+        <w:tc>
+          <w:tcPr>
+            <w:tcW w:type="dxa" w:w="1728"/>
+          </w:tcPr>
+          <w:p>
+            <w:r/>
+          </w:p>
+        </w:tc>
       </w:tr>
       <w:tr>
         <w:tc>
           <w:tcPr>
-            <w:tcW w:type="dxa" w:w="2160"/>
+            <w:tcW w:type="dxa" w:w="1728"/>
           </w:tcPr>
           <w:p>
             <w:r>
@@ -1839,7 +2146,7 @@
         </w:tc>
         <w:tc>
           <w:tcPr>
-            <w:tcW w:type="dxa" w:w="2160"/>
+            <w:tcW w:type="dxa" w:w="1728"/>
           </w:tcPr>
           <w:p>
             <w:r>
@@ -1849,7 +2156,7 @@
         </w:tc>
         <w:tc>
           <w:tcPr>
-            <w:tcW w:type="dxa" w:w="2160"/>
+            <w:tcW w:type="dxa" w:w="1728"/>
           </w:tcPr>
           <w:p>
             <w:r>
@@ -1859,7 +2166,7 @@
         </w:tc>
         <w:tc>
           <w:tcPr>
-            <w:tcW w:type="dxa" w:w="2160"/>
+            <w:tcW w:type="dxa" w:w="1728"/>
           </w:tcPr>
           <w:p>
             <w:r>
@@ -1867,11 +2174,19 @@
             </w:r>
           </w:p>
         </w:tc>
+        <w:tc>
+          <w:tcPr>
+            <w:tcW w:type="dxa" w:w="1728"/>
+          </w:tcPr>
+          <w:p>
+            <w:r/>
+          </w:p>
+        </w:tc>
       </w:tr>
       <w:tr>
         <w:tc>
           <w:tcPr>
-            <w:tcW w:type="dxa" w:w="2160"/>
+            <w:tcW w:type="dxa" w:w="1728"/>
           </w:tcPr>
           <w:p>
             <w:r>
@@ -1881,7 +2196,7 @@
         </w:tc>
         <w:tc>
           <w:tcPr>
-            <w:tcW w:type="dxa" w:w="2160"/>
+            <w:tcW w:type="dxa" w:w="1728"/>
           </w:tcPr>
           <w:p>
             <w:r>
@@ -1891,7 +2206,7 @@
         </w:tc>
         <w:tc>
           <w:tcPr>
-            <w:tcW w:type="dxa" w:w="2160"/>
+            <w:tcW w:type="dxa" w:w="1728"/>
           </w:tcPr>
           <w:p>
             <w:r>
@@ -1901,11 +2216,71 @@
         </w:tc>
         <w:tc>
           <w:tcPr>
-            <w:tcW w:type="dxa" w:w="2160"/>
+            <w:tcW w:type="dxa" w:w="1728"/>
           </w:tcPr>
           <w:p>
             <w:r>
               <w:t>Rebuilt the investor map coverage-first per direction: the full Damodaran classification universe mapped to the 12 incentivized sectors WITHOUT a profitability gate -- 19,795 companies across 107 countries (profitability stays a per-name attribute, 147 verified). Published as a…</w:t>
+            </w:r>
+          </w:p>
+        </w:tc>
+        <w:tc>
+          <w:tcPr>
+            <w:tcW w:type="dxa" w:w="1728"/>
+          </w:tcPr>
+          <w:p>
+            <w:r/>
+          </w:p>
+        </w:tc>
+      </w:tr>
+      <w:tr>
+        <w:tc>
+          <w:tcPr>
+            <w:tcW w:type="dxa" w:w="1728"/>
+          </w:tcPr>
+          <w:p>
+            <w:r>
+              <w:t>39</w:t>
+            </w:r>
+          </w:p>
+        </w:tc>
+        <w:tc>
+          <w:tcPr>
+            <w:tcW w:type="dxa" w:w="1728"/>
+          </w:tcPr>
+          <w:p>
+            <w:r>
+              <w:t>digital-twin-for-ipa: full 86-entity sweep, interlinkage graph, PRS budget layer -- new public repo</w:t>
+            </w:r>
+          </w:p>
+        </w:tc>
+        <w:tc>
+          <w:tcPr>
+            <w:tcW w:type="dxa" w:w="1728"/>
+          </w:tcPr>
+          <w:p>
+            <w:r>
+              <w:t>digital-twin-for-ipa (NEW -- github.com/herrrickshaw/digital-twin-for-ipa)</w:t>
+            </w:r>
+          </w:p>
+        </w:tc>
+        <w:tc>
+          <w:tcPr>
+            <w:tcW w:type="dxa" w:w="1728"/>
+          </w:tcPr>
+          <w:p>
+            <w:r>
+              <w:t>The remaining 70 ministries were swept by 8 parallel agents and the whole program re-packaged as a machine-readable digital twin of India's Investment Promotion Apparatus: 11 layers, with all 86 PIB-register entities now carrying verdicts (HAS-INCENTIVES / THIN / N/A / SUPERSEDE…</w:t>
+            </w:r>
+          </w:p>
+        </w:tc>
+        <w:tc>
+          <w:tcPr>
+            <w:tcW w:type="dxa" w:w="1728"/>
+          </w:tcPr>
+          <w:p>
+            <w:r>
+              <w:t>Layer 10 (interlinkages): 23 stack/exclude/converge/feed edges -- MeitY PLI FAQ…; Layer 11 (PRS): budget-utilization reality for 12 ministries -- Semicon India 2…; Two displayed contradictions flagged for resolution before citation: coal-gasif…; Honest negatives kept as data: EL…</w:t>
             </w:r>
           </w:p>
         </w:tc>
@@ -2077,7 +2452,7 @@
     </w:p>
     <w:p>
       <w:r>
-        <w:t>All 38 phases published across three public repos. The investor layer is complete coverage-first (19,795 companies/107 countries mapped to the incentivized sectors, with verified-profitability and pairing attribute layers), and the ministry universe is now enumerated in full (86 entities from the register; 16 incentive-cataloged, 70 pending the next sweep).</w:t>
+        <w:t>All 39 phases published across four public repos. The digital twin (digital-twin-for-ipa) is live with 11 layers: 86/86 entities resolved, catalog v2 across 8 sweep clusters, a 23-edge scheme-interlinkage graph with no existing substitute anywhere, and the PRS budget-utilization overlay.</w:t>
       </w:r>
     </w:p>
     <w:sectPr>

</xml_diff>

<commit_message>
docs: session summary phase 40 -- state incentive sweep (30 states/UTs, 117 policies, central-state stack verified on-page)
Co-Authored-By: Claude Fable 5 <noreply@anthropic.com>
</commit_message>
<xml_diff>
--- a/reports/published/session_summary_2026-07-19.docx
+++ b/reports/published/session_summary_2026-07-19.docx
@@ -2285,6 +2285,58 @@
           </w:p>
         </w:tc>
       </w:tr>
+      <w:tr>
+        <w:tc>
+          <w:tcPr>
+            <w:tcW w:type="dxa" w:w="1728"/>
+          </w:tcPr>
+          <w:p>
+            <w:r>
+              <w:t>40</w:t>
+            </w:r>
+          </w:p>
+        </w:tc>
+        <w:tc>
+          <w:tcPr>
+            <w:tcW w:type="dxa" w:w="1728"/>
+          </w:tcPr>
+          <w:p>
+            <w:r>
+              <w:t>State-government incentive sweep: layer 12 of the digital twin -- 30 states/UTs, 117 site-verified policies</w:t>
+            </w:r>
+          </w:p>
+        </w:tc>
+        <w:tc>
+          <w:tcPr>
+            <w:tcW w:type="dxa" w:w="1728"/>
+          </w:tcPr>
+          <w:p>
+            <w:r>
+              <w:t>digital-twin-for-ipa (layers/12_state_catalog/, 6 cluster files)</w:t>
+            </w:r>
+          </w:p>
+        </w:tc>
+        <w:tc>
+          <w:tcPr>
+            <w:tcW w:type="dxa" w:w="1728"/>
+          </w:tcPr>
+          <w:p>
+            <w:r>
+              <w:t>Six parallel agents swept state single-window and industries-department websites (first launch killed en masse by the usage limit; relaunched verbatim after reset). The layer's central thesis-confirming result: the central-to-state incentive stack is now PRIMARY-SOURCE-verified…</w:t>
+            </w:r>
+          </w:p>
+        </w:tc>
+        <w:tc>
+          <w:tcPr>
+            <w:tcW w:type="dxa" w:w="1728"/>
+          </w:tcPr>
+          <w:p>
+            <w:r>
+              <w:t>A 2025-26 state policy wave documented: Maharashtra MIISP 2025 (the actual PSI-…; Fully quantified packages: TN's four mutually-exclusive options (100% SGST 15y…; Honest gaps recorded as data: Telangana and Delhi have NO current umbrella indu…; Two hijacked/squatted domains disc…</w:t>
+            </w:r>
+          </w:p>
+        </w:tc>
+      </w:tr>
     </w:tbl>
     <w:p/>
     <w:p>
@@ -2452,7 +2504,7 @@
     </w:p>
     <w:p>
       <w:r>
-        <w:t>All 39 phases published across four public repos. The digital twin (digital-twin-for-ipa) is live with 11 layers: 86/86 entities resolved, catalog v2 across 8 sweep clusters, a 23-edge scheme-interlinkage graph with no existing substitute anywhere, and the PRS budget-utilization overlay.</w:t>
+        <w:t>All 40 phases published across four public repos. The digital twin now spans both government tiers: 86/86 central entities (catalog v2, 8 clusters) AND 30 states/UTs (state catalog, 6 clusters, 117 policies), joined by the 23-edge interlinkage graph -- whose stacking thesis the state layer confirms with four on-page central-to-state top-ups -- and the PRS budget-utilization overlay.</w:t>
       </w:r>
     </w:p>
     <w:sectPr>

</xml_diff>

<commit_message>
docs: session summary phase 41 -- OCR extraction of Viksit Gujarat 2026 + Punjab IBDP 2026
Co-Authored-By: Claude Fable 5 <noreply@anthropic.com>
</commit_message>
<xml_diff>
--- a/reports/published/session_summary_2026-07-19.docx
+++ b/reports/published/session_summary_2026-07-19.docx
@@ -2337,6 +2337,58 @@
           </w:p>
         </w:tc>
       </w:tr>
+      <w:tr>
+        <w:tc>
+          <w:tcPr>
+            <w:tcW w:type="dxa" w:w="1728"/>
+          </w:tcPr>
+          <w:p>
+            <w:r>
+              <w:t>41</w:t>
+            </w:r>
+          </w:p>
+        </w:tc>
+        <w:tc>
+          <w:tcPr>
+            <w:tcW w:type="dxa" w:w="1728"/>
+          </w:tcPr>
+          <w:p>
+            <w:r>
+              <w:t>OCR extraction of the two scanned state policies -- Viksit Gujarat 2026 and Punjab IBDP 2026 fully quantified</w:t>
+            </w:r>
+          </w:p>
+        </w:tc>
+        <w:tc>
+          <w:tcPr>
+            <w:tcW w:type="dxa" w:w="1728"/>
+          </w:tcPr>
+          <w:p>
+            <w:r>
+              <w:t>digital-twin-for-ipa (layers/12_state_catalog/ocr_extracts_gj_pb.json)</w:t>
+            </w:r>
+          </w:p>
+        </w:tc>
+        <w:tc>
+          <w:tcPr>
+            <w:tcW w:type="dxa" w:w="1728"/>
+          </w:tcPr>
+          <w:p>
+            <w:r>
+              <w:t>The two policies flagged un-extractable in phase 40 were OCR'd end-to-end (pdftoppm 150dpi + tesseract over all 107 pages) and turned out to be ENGLISH throughout -- the language check found the only vernacular content is the Punjabi script inside Punjab's state emblem, so no tr…</w:t>
+            </w:r>
+          </w:p>
+        </w:tc>
+        <w:tc>
+          <w:tcPr>
+            <w:tcW w:type="dxa" w:w="1728"/>
+          </w:tcPr>
+          <w:p>
+            <w:r>
+              <w:t>Viksit Gujarat 2026: choose-your-combination structure (capital subsidy + 7% in…; Punjab IBDP 2026 (gazette 8-Mar-2026): overall ceiling 100% of FCI (125% in Bor…; Both cluster entries in layer 12 upgraded from 'not extractable' to fully quant…</w:t>
+            </w:r>
+          </w:p>
+        </w:tc>
+      </w:tr>
     </w:tbl>
     <w:p/>
     <w:p>
@@ -2504,7 +2556,7 @@
     </w:p>
     <w:p>
       <w:r>
-        <w:t>All 40 phases published across four public repos. The digital twin now spans both government tiers: 86/86 central entities (catalog v2, 8 clusters) AND 30 states/UTs (state catalog, 6 clusters, 117 policies), joined by the 23-edge interlinkage graph -- whose stacking thesis the state layer confirms with four on-page central-to-state top-ups -- and the PRS budget-utilization overlay.</w:t>
+        <w:t>All 41 phases published across four public repos. The digital twin's state layer is now fully quantified end-to-end: no remaining un-extractable policy documents -- the two scanned PDFs (Viksit Gujarat 2026, Punjab IBDP 2026) were OCR'd and their complete incentive matrices added to layer 12.</w:t>
       </w:r>
     </w:p>
     <w:sectPr>

</xml_diff>

<commit_message>
docs: session summary phase 42 -- canonical data model, 312-instrument index, update engine, UNNATI closure
Co-Authored-By: Claude Fable 5 <noreply@anthropic.com>
</commit_message>
<xml_diff>
--- a/reports/published/session_summary_2026-07-19.docx
+++ b/reports/published/session_summary_2026-07-19.docx
@@ -2389,6 +2389,58 @@
           </w:p>
         </w:tc>
       </w:tr>
+      <w:tr>
+        <w:tc>
+          <w:tcPr>
+            <w:tcW w:type="dxa" w:w="1728"/>
+          </w:tcPr>
+          <w:p>
+            <w:r>
+              <w:t>42</w:t>
+            </w:r>
+          </w:p>
+        </w:tc>
+        <w:tc>
+          <w:tcPr>
+            <w:tcW w:type="dxa" w:w="1728"/>
+          </w:tcPr>
+          <w:p>
+            <w:r>
+              <w:t>Canonical data model, 312-instrument flat index, source flowchart, auto-update engine -- and UNNATI verified CLOSED-oversubscribed</w:t>
+            </w:r>
+          </w:p>
+        </w:tc>
+        <w:tc>
+          <w:tcPr>
+            <w:tcW w:type="dxa" w:w="1728"/>
+          </w:tcPr>
+          <w:p>
+            <w:r>
+              <w:t>digital-twin-for-ipa (layers/00_data_model.json, 13_flat_instrument_index.json, 14_update_engine.json, docs/DATA_MODEL.md)</w:t>
+            </w:r>
+          </w:p>
+        </w:tc>
+        <w:tc>
+          <w:tcPr>
+            <w:tcW w:type="dxa" w:w="1728"/>
+          </w:tcPr>
+          <w:p>
+            <w:r>
+              <w:t>The twin's accumulated data now has a clean extraction model: nine keyed entity types (OfferingEntity, Instrument, ApplicationWindow, InterlinkageEdge, BudgetObservation, Company, Pairing, SourceRoute, append-only Observation) that every sweep maps into, plus a flat query-ready…</w:t>
+            </w:r>
+          </w:p>
+        </w:tc>
+        <w:tc>
+          <w:tcPr>
+            <w:tcW w:type="dxa" w:w="1728"/>
+          </w:tcPr>
+          <w:p>
+            <w:r>
+              <w:t>UNNATI 2024 live-verified on unnati.dpiit.gov.in: registration STOPPED because…; Auto-update engine (layer 14): per-source refresh design -- PIB daily (pib_inde…; Orbis (Bureau van Dijk) mapped as the target source for the twin's known covera…; Information flowchart (docs/DATA_M…</w:t>
+            </w:r>
+          </w:p>
+        </w:tc>
+      </w:tr>
     </w:tbl>
     <w:p/>
     <w:p>
@@ -2556,7 +2608,7 @@
     </w:p>
     <w:p>
       <w:r>
-        <w:t>All 41 phases published across four public repos. The digital twin's state layer is now fully quantified end-to-end: no remaining un-extractable policy documents -- the two scanned PDFs (Viksit Gujarat 2026, Punjab IBDP 2026) were OCR'd and their complete incentive matrices added to layer 12.</w:t>
+        <w:t>All 42 phases published across four public repos. The digital twin is now a modeled system, not a document pile: 312 instruments in one canonical schema across both government tiers, a source-&gt;model-&gt;product flowchart, and a per-source auto-update engine (PIB daily through quarterly sweeps, with an Orbis upgrade path for unlisted-company coverage). UNNATI 2024 verified CLOSED-oversubscribed on the DPIIT portal.</w:t>
       </w:r>
     </w:p>
     <w:sectPr>

</xml_diff>

<commit_message>
docs: session summary phase 45 -- n8n auto-refresh workflow
Co-Authored-By: Claude Fable 5 <noreply@anthropic.com>
</commit_message>
<xml_diff>
--- a/reports/published/session_summary_2026-07-19.docx
+++ b/reports/published/session_summary_2026-07-19.docx
@@ -2545,6 +2545,58 @@
           </w:p>
         </w:tc>
       </w:tr>
+      <w:tr>
+        <w:tc>
+          <w:tcPr>
+            <w:tcW w:type="dxa" w:w="1728"/>
+          </w:tcPr>
+          <w:p>
+            <w:r>
+              <w:t>45</w:t>
+            </w:r>
+          </w:p>
+        </w:tc>
+        <w:tc>
+          <w:tcPr>
+            <w:tcW w:type="dxa" w:w="1728"/>
+          </w:tcPr>
+          <w:p>
+            <w:r>
+              <w:t>n8n workflow for the twin's auto-refresh -- CHANGE detection, email alerting, snapshot commits</w:t>
+            </w:r>
+          </w:p>
+        </w:tc>
+        <w:tc>
+          <w:tcPr>
+            <w:tcW w:type="dxa" w:w="1728"/>
+          </w:tcPr>
+          <w:p>
+            <w:r>
+              <w:t>digital-twin-for-ipa (workflows/n8n_twin_refresh.json + workflows/README.md)</w:t>
+            </w:r>
+          </w:p>
+        </w:tc>
+        <w:tc>
+          <w:tcPr>
+            <w:tcW w:type="dxa" w:w="1728"/>
+          </w:tcPr>
+          <w:p>
+            <w:r>
+              <w:t>An importable n8n workflow now wraps the same refresh_twin.py engine the crontab runs, adding what plain cron cannot: a Code node that parses run output for CHANGE/DOWN lines and raises a synthetic same-day alert if the UNNATI portal notice ever flips to registration_stopped=Fal…</w:t>
+            </w:r>
+          </w:p>
+        </w:tc>
+        <w:tc>
+          <w:tcPr>
+            <w:tcW w:type="dxa" w:w="1728"/>
+          </w:tcPr>
+          <w:p>
+            <w:r>
+              <w:t>Wiring: Daily-07:17 -&gt; pib; Weekly-Mon-08:23 + Manual -&gt; weekly -&gt; Detect-CHANG…; Scheduler-overlap decision documented in workflows/README.md: keep cron primary…; n8n itself: npm install -g n8n kicked off (large package); workflow import (n8n…</w:t>
+            </w:r>
+          </w:p>
+        </w:tc>
+      </w:tr>
     </w:tbl>
     <w:p/>
     <w:p>
@@ -2712,7 +2764,7 @@
     </w:p>
     <w:p>
       <w:r>
-        <w:t>All 44 phases published across four public repos. The digital twin is now operationally live: cron-scheduled daily PIB updates and weekly portal/UNNATI/RBI checks feeding append-only snapshots, on top of the canonical model, 312-instrument index, generated catalogue, directory and glossary.</w:t>
+        <w:t>All 45 phases published across four public repos. The twin now has two interchangeable schedulers: the installed crontab (primary, zero-dependency) and an importable n8n workflow adding CHANGE-detection, email alerting, and snapshot commits -- with the UNNATI-resumption flip wired as the highest-value alert.</w:t>
       </w:r>
     </w:p>
     <w:sectPr>

</xml_diff>

<commit_message>
docs: session summary phase 46 -- n8n install (Node-26 silent rollback, nvm Node-22 workaround)
Co-Authored-By: Claude Fable 5 <noreply@anthropic.com>
</commit_message>
<xml_diff>
--- a/reports/published/session_summary_2026-07-19.docx
+++ b/reports/published/session_summary_2026-07-19.docx
@@ -2597,6 +2597,58 @@
           </w:p>
         </w:tc>
       </w:tr>
+      <w:tr>
+        <w:tc>
+          <w:tcPr>
+            <w:tcW w:type="dxa" w:w="1728"/>
+          </w:tcPr>
+          <w:p>
+            <w:r>
+              <w:t>46</w:t>
+            </w:r>
+          </w:p>
+        </w:tc>
+        <w:tc>
+          <w:tcPr>
+            <w:tcW w:type="dxa" w:w="1728"/>
+          </w:tcPr>
+          <w:p>
+            <w:r>
+              <w:t>n8n local install -- Node-26 incompatibility found and worked around via nvm Node 22</w:t>
+            </w:r>
+          </w:p>
+        </w:tc>
+        <w:tc>
+          <w:tcPr>
+            <w:tcW w:type="dxa" w:w="1728"/>
+          </w:tcPr>
+          <w:p>
+            <w:r>
+              <w:t>machine setup (no repo changes; workflow JSON already pushed in phase 45)</w:t>
+            </w:r>
+          </w:p>
+        </w:tc>
+        <w:tc>
+          <w:tcPr>
+            <w:tcW w:type="dxa" w:w="1728"/>
+          </w:tcPr>
+          <w:p>
+            <w:r>
+              <w:t>The first npm install -g n8n under Homebrew Node v26 FAILED SILENTLY: exit code 0 but npm rolled the package back because n8n's isolated-vm native dependency does not compile on Node 26 (n8n targets LTS 20/22) -- leaving only a dangling /opt/homebrew/bin/n8n symlink (removed). T…</w:t>
+            </w:r>
+          </w:p>
+        </w:tc>
+        <w:tc>
+          <w:tcPr>
+            <w:tcW w:type="dxa" w:w="1728"/>
+          </w:tcPr>
+          <w:p>
+            <w:r>
+              <w:t>Workaround in progress at time of writing: Node 22.23.1 installed via the machi…; Next step once it lands: n8n import:workflow --input=workflows/n8n_twin_refresh…; Scheduler stance unchanged: crontab stays primary; n8n adds the CHANGE-detectio…</w:t>
+            </w:r>
+          </w:p>
+        </w:tc>
+      </w:tr>
     </w:tbl>
     <w:p/>
     <w:p>
@@ -2764,7 +2816,7 @@
     </w:p>
     <w:p>
       <w:r>
-        <w:t>All 45 phases published across four public repos. The twin now has two interchangeable schedulers: the installed crontab (primary, zero-dependency) and an importable n8n workflow adding CHANGE-detection, email alerting, and snapshot commits -- with the UNNATI-resumption flip wired as the highest-value alert.</w:t>
+        <w:t>All 46 phases logged across four public repos. Twin automation: crontab live and test-run; n8n workflow pushed; local n8n install being redone under nvm Node 22 after the Node-26 isolated-vm build failure (a silent exit-0 rollback).</w:t>
       </w:r>
     </w:p>
     <w:sectPr>

</xml_diff>

<commit_message>
docs: session summary phase 47 -- n8n installed (Node 22) and TwinRefreshIPA001 imported
Co-Authored-By: Claude Fable 5 <noreply@anthropic.com>
</commit_message>
<xml_diff>
--- a/reports/published/session_summary_2026-07-19.docx
+++ b/reports/published/session_summary_2026-07-19.docx
@@ -2649,6 +2649,58 @@
           </w:p>
         </w:tc>
       </w:tr>
+      <w:tr>
+        <w:tc>
+          <w:tcPr>
+            <w:tcW w:type="dxa" w:w="1728"/>
+          </w:tcPr>
+          <w:p>
+            <w:r>
+              <w:t>47</w:t>
+            </w:r>
+          </w:p>
+        </w:tc>
+        <w:tc>
+          <w:tcPr>
+            <w:tcW w:type="dxa" w:w="1728"/>
+          </w:tcPr>
+          <w:p>
+            <w:r>
+              <w:t>n8n installed under Node 22 and the twin workflow imported -- TwinRefreshIPA001 registered</w:t>
+            </w:r>
+          </w:p>
+        </w:tc>
+        <w:tc>
+          <w:tcPr>
+            <w:tcW w:type="dxa" w:w="1728"/>
+          </w:tcPr>
+          <w:p>
+            <w:r>
+              <w:t>digital-twin-for-ipa (workflows/n8n_twin_refresh.json id-fix) + machine setup</w:t>
+            </w:r>
+          </w:p>
+        </w:tc>
+        <w:tc>
+          <w:tcPr>
+            <w:tcW w:type="dxa" w:w="1728"/>
+          </w:tcPr>
+          <w:p>
+            <w:r>
+              <w:t>n8n installed cleanly under nvm Node 22.23.1 (~/.nvm/versions/node/v22.23.1/bin/n8n) after the Node-26 isolated-vm build failure, and the workflow imported and verified: n8n list:workflow shows 'TwinRefreshIPA001 | Digital Twin IPA -- auto-refresh'. The import surfaced one final…</w:t>
+            </w:r>
+          </w:p>
+        </w:tc>
+        <w:tc>
+          <w:tcPr>
+            <w:tcW w:type="dxa" w:w="1728"/>
+          </w:tcPr>
+          <w:p>
+            <w:r>
+              <w:t>Imported INACTIVE by design: the crontab remains the primary scheduler; activat…; Timezone pinned Asia/Kolkata in workflow settings; the dangling /opt/homebrew/b…</w:t>
+            </w:r>
+          </w:p>
+        </w:tc>
+      </w:tr>
     </w:tbl>
     <w:p/>
     <w:p>
@@ -2816,7 +2868,7 @@
     </w:p>
     <w:p>
       <w:r>
-        <w:t>All 46 phases logged across four public repos. Twin automation: crontab live and test-run; n8n workflow pushed; local n8n install being redone under nvm Node 22 after the Node-26 isolated-vm build failure (a silent exit-0 rollback).</w:t>
+        <w:t>All 47 phases logged across four public repos. Twin automation complete on both tracks: crontab live and test-run (daily PIB, weekly checks), and n8n installed with the workflow imported as TwinRefreshIPA001 (inactive; manual-trigger alerting pipeline ready, SMTP credential pending user attachment).</w:t>
       </w:r>
     </w:p>
     <w:sectPr>

</xml_diff>

<commit_message>
docs: session summary phase 48 -- credential-free email alerting live and tested
Co-Authored-By: Claude Fable 5 <noreply@anthropic.com>
</commit_message>
<xml_diff>
--- a/reports/published/session_summary_2026-07-19.docx
+++ b/reports/published/session_summary_2026-07-19.docx
@@ -2701,6 +2701,58 @@
           </w:p>
         </w:tc>
       </w:tr>
+      <w:tr>
+        <w:tc>
+          <w:tcPr>
+            <w:tcW w:type="dxa" w:w="1728"/>
+          </w:tcPr>
+          <w:p>
+            <w:r>
+              <w:t>48</w:t>
+            </w:r>
+          </w:p>
+        </w:tc>
+        <w:tc>
+          <w:tcPr>
+            <w:tcW w:type="dxa" w:w="1728"/>
+          </w:tcPr>
+          <w:p>
+            <w:r>
+              <w:t>Email alerting live and tested -- credential-free design via runtime plist sourcing</w:t>
+            </w:r>
+          </w:p>
+        </w:tc>
+        <w:tc>
+          <w:tcPr>
+            <w:tcW w:type="dxa" w:w="1728"/>
+          </w:tcPr>
+          <w:p>
+            <w:r>
+              <w:t>digital-twin-for-ipa (scripts/send_twin_alert.py; cron weekly pipe; n8n workflow re-imported)</w:t>
+            </w:r>
+          </w:p>
+        </w:tc>
+        <w:tc>
+          <w:tcPr>
+            <w:tcW w:type="dxa" w:w="1728"/>
+          </w:tcPr>
+          <w:p>
+            <w:r>
+              <w:t>Rather than attaching the Gmail app password to n8n's credential store (which would mean handling the secret in plain text -- the established credential boundary), the alert path was built credential-free: send_twin_alert.py sources GMAIL_USER/GMAIL_APP_PASSWORD/MAIL_TO at runti…</w:t>
+            </w:r>
+          </w:p>
+        </w:tc>
+        <w:tc>
+          <w:tcPr>
+            <w:tcW w:type="dxa" w:w="1728"/>
+          </w:tcPr>
+          <w:p>
+            <w:r>
+              <w:t>Tested with three delivered emails: basic --test send; silent path verified (no…; Cron: the weekly Monday line now pipes refresh output through send_twin_alert.p…; n8n: the emailSend node was replaced with a credential-free executeCommand call…</w:t>
+            </w:r>
+          </w:p>
+        </w:tc>
+      </w:tr>
     </w:tbl>
     <w:p/>
     <w:p>
@@ -2868,7 +2920,7 @@
     </w:p>
     <w:p>
       <w:r>
-        <w:t>All 47 phases logged across four public repos. Twin automation complete on both tracks: crontab live and test-run (daily PIB, weekly checks), and n8n installed with the workflow imported as TwinRefreshIPA001 (inactive; manual-trigger alerting pipeline ready, SMTP credential pending user attachment).</w:t>
+        <w:t>All 48 phases logged across four public repos. The twin's automation loop is closed end-to-end: cron-scheduled refreshes -&gt; append-only snapshots -&gt; CHANGE detection -&gt; credential-free email alerts (tested, delivered), with n8n as the imported alternative scheduler needing zero credential setup.</w:t>
       </w:r>
     </w:p>
     <w:sectPr>

</xml_diff>

<commit_message>
docs: session summary phase 49 -- e2e weekly pipeline test with real route-recovery event
Co-Authored-By: Claude Fable 5 <noreply@anthropic.com>
</commit_message>
<xml_diff>
--- a/reports/published/session_summary_2026-07-19.docx
+++ b/reports/published/session_summary_2026-07-19.docx
@@ -2753,6 +2753,58 @@
           </w:p>
         </w:tc>
       </w:tr>
+      <w:tr>
+        <w:tc>
+          <w:tcPr>
+            <w:tcW w:type="dxa" w:w="1728"/>
+          </w:tcPr>
+          <w:p>
+            <w:r>
+              <w:t>49</w:t>
+            </w:r>
+          </w:p>
+        </w:tc>
+        <w:tc>
+          <w:tcPr>
+            <w:tcW w:type="dxa" w:w="1728"/>
+          </w:tcPr>
+          <w:p>
+            <w:r>
+              <w:t>End-to-end weekly pipeline test -- validated by a real, organic route-recovery event</w:t>
+            </w:r>
+          </w:p>
+        </w:tc>
+        <w:tc>
+          <w:tcPr>
+            <w:tcW w:type="dxa" w:w="1728"/>
+          </w:tcPr>
+          <w:p>
+            <w:r>
+              <w:t>digital-twin-for-ipa (state/ snapshots + cron.log evidence, committed)</w:t>
+            </w:r>
+          </w:p>
+        </w:tc>
+        <w:tc>
+          <w:tcPr>
+            <w:tcW w:type="dxa" w:w="1728"/>
+          </w:tcPr>
+          <w:p>
+            <w:r>
+              <w:t>The full weekly pipeline was run once under the exact installed cron invocation (env -i with the crontab's PATH) and validated itself with a REAL event rather than a synthetic trigger: UP Nivesh Mitra had come back online since the afternoon snapshot, producing 'CHANGE route UP…</w:t>
+            </w:r>
+          </w:p>
+        </w:tc>
+        <w:tc>
+          <w:tcPr>
+            <w:tcW w:type="dxa" w:w="1728"/>
+          </w:tcPr>
+          <w:p>
+            <w:r>
+              <w:t>Full chain in one pass: 64 routes checked (3 down -- DSIR CMS, BIRAC, Silpasath…; Snapshot-diff mechanics proven: same-day re-run compared against the afternoon…; Evidence committed and pushed. Next scheduled firings: daily PIB 07:17 tomorrow…</w:t>
+            </w:r>
+          </w:p>
+        </w:tc>
+      </w:tr>
     </w:tbl>
     <w:p/>
     <w:p>
@@ -2920,7 +2972,7 @@
     </w:p>
     <w:p>
       <w:r>
-        <w:t>All 48 phases logged across four public repos. The twin's automation loop is closed end-to-end: cron-scheduled refreshes -&gt; append-only snapshots -&gt; CHANGE detection -&gt; credential-free email alerts (tested, delivered), with n8n as the imported alternative scheduler needing zero credential setup.</w:t>
+        <w:t>All 49 phases logged across four public repos. The twin's automation is verified in production conditions: the exact cron pipeline ran end-to-end and caught a real portal-recovery event, delivering the alert email unprompted. System fully operational; next firings are on the installed schedule.</w:t>
       </w:r>
     </w:p>
     <w:sectPr>

</xml_diff>

<commit_message>
docs: session summary phase 50 -- interlinkage verification vs Drishti + 6 IAS sources
Co-Authored-By: Claude Fable 5 <noreply@anthropic.com>
</commit_message>
<xml_diff>
--- a/reports/published/session_summary_2026-07-19.docx
+++ b/reports/published/session_summary_2026-07-19.docx
@@ -2805,6 +2805,58 @@
           </w:p>
         </w:tc>
       </w:tr>
+      <w:tr>
+        <w:tc>
+          <w:tcPr>
+            <w:tcW w:type="dxa" w:w="1728"/>
+          </w:tcPr>
+          <w:p>
+            <w:r>
+              <w:t>50</w:t>
+            </w:r>
+          </w:p>
+        </w:tc>
+        <w:tc>
+          <w:tcPr>
+            <w:tcW w:type="dxa" w:w="1728"/>
+          </w:tcPr>
+          <w:p>
+            <w:r>
+              <w:t>Interlinkage graph verified against Drishti IAS + 6 other IAS sources -- 12 confirmed, 3 resolved, 1 disputed, NIPU-2026 vindicated</w:t>
+            </w:r>
+          </w:p>
+        </w:tc>
+        <w:tc>
+          <w:tcPr>
+            <w:tcW w:type="dxa" w:w="1728"/>
+          </w:tcPr>
+          <w:p>
+            <w:r>
+              <w:t>digital-twin-for-ipa (layers/10_interlinkages.json: verification block, 12 new edges, 3 corrections)</w:t>
+            </w:r>
+          </w:p>
+        </w:tc>
+        <w:tc>
+          <w:tcPr>
+            <w:tcW w:type="dxa" w:w="1728"/>
+          </w:tcPr>
+          <w:p>
+            <w:r>
+              <w:t>Two agents checked all 23 edges' RELATIONSHIP claims against drishtiias.com and vajiram/pwonlyias/insights/clearias/forumias/nextias/visionias. Twelve edges confirmed (AIF-PMFME 'over and above the 35% subsidy' verbatim on two source families; ECMS-ISM boundary; RoDTEP halt-and-…</w:t>
+            </w:r>
+          </w:p>
+        </w:tc>
+        <w:tc>
+          <w:tcPr>
+            <w:tcW w:type="dxa" w:w="1728"/>
+          </w:tcPr>
+          <w:p>
+            <w:r>
+              <w:t>Resolved: (1) ECMS-MPMS boundary -- finished phones (sales-linked 2.25-5%) vs c…; Downgraded to DISPUTED: coal-gasification incentive percentage -- the secondary…; Still open: SEZ+PLI eligibility (no source resolves it; new context: SEZ Rule 1…; 12 new edges added (all SECONDARY…</w:t>
+            </w:r>
+          </w:p>
+        </w:tc>
+      </w:tr>
     </w:tbl>
     <w:p/>
     <w:p>
@@ -2972,7 +3024,7 @@
     </w:p>
     <w:p>
       <w:r>
-        <w:t>All 49 phases logged across four public repos. The twin's automation is verified in production conditions: the exact cron pipeline ran end-to-end and caught a real portal-recovery event, delivering the alert email unprompted. System fully operational; next firings are on the installed schedule.</w:t>
+        <w:t>All 50 phases logged across four public repos. The interlinkage graph is now source-verified edge-by-edge: 12 confirmed, 2 resolved, 1 vindicated against the aggregators (NIPU-2026), 1 honestly disputed pending the official PDF, 1 still open (SEZ+PLI), and 12 new edges added -- on top of the operationally-live automation loop.</w:t>
       </w:r>
     </w:p>
     <w:sectPr>

</xml_diff>

<commit_message>
docs: session summary phase 51 -- reportage gap audit + EV decks updated with twin-verified data
Co-Authored-By: Claude Fable 5 <noreply@anthropic.com>
</commit_message>
<xml_diff>
--- a/reports/published/session_summary_2026-07-19.docx
+++ b/reports/published/session_summary_2026-07-19.docx
@@ -7,7 +7,7 @@
         <w:pStyle w:val="Title"/>
       </w:pPr>
       <w:r>
-        <w:t>Session Summary -- India Trade &amp; Policy Program (through 2026-07-20)</w:t>
+        <w:t>Session Summary -- India Trade &amp; Policy Program (through 2026-07-21)</w:t>
       </w:r>
     </w:p>
     <w:p>
@@ -2857,6 +2857,58 @@
           </w:p>
         </w:tc>
       </w:tr>
+      <w:tr>
+        <w:tc>
+          <w:tcPr>
+            <w:tcW w:type="dxa" w:w="1728"/>
+          </w:tcPr>
+          <w:p>
+            <w:r>
+              <w:t>51</w:t>
+            </w:r>
+          </w:p>
+        </w:tc>
+        <w:tc>
+          <w:tcPr>
+            <w:tcW w:type="dxa" w:w="1728"/>
+          </w:tcPr>
+          <w:p>
+            <w:r>
+              <w:t>Reportage gap audit + EV decks analysed and updated with twin-verified data</w:t>
+            </w:r>
+          </w:p>
+        </w:tc>
+        <w:tc>
+          <w:tcPr>
+            <w:tcW w:type="dxa" w:w="1728"/>
+          </w:tcPr>
+          <w:p>
+            <w:r>
+              <w:t>digital-twin-for-ipa (reportage fixes) + Google Drive / Dropbox (updated decks)</w:t>
+            </w:r>
+          </w:p>
+        </w:tc>
+        <w:tc>
+          <w:tcPr>
+            <w:tcW w:type="dxa" w:w="1728"/>
+          </w:tcPr>
+          <w:p>
+            <w:r>
+              <w:t>Two workstreams closed. (1) REPORTAGE GAP AUDIT vs Drishti IAS, Vision IAS and all 18 PRS Monthly Policy Reviews: pre-audit coverage was ~45-55% of PRS-recorded incentive actions, with a SYSTEMIC cause -- the SQL pre-filter only regex-scanned titles containing 'scheme/incentive/…</w:t>
+            </w:r>
+          </w:p>
+        </w:tc>
+        <w:tc>
+          <w:tcPr>
+            <w:tcW w:type="dxa" w:w="1728"/>
+          </w:tcPr>
+          <w:p>
+            <w:r>
+              <w:t>Audit resolutions of note: SHAKTI regex had to handle the scheme's own 'Koyala'…; Process error disclosed: one mis-directed commit landed in the policy repo swee…; Deck QA: all 4 changed slides rendered via LibreOffice and inspected (no overfl…; Sharing attempt: Dropbox MCP conn…</w:t>
+            </w:r>
+          </w:p>
+        </w:tc>
+      </w:tr>
     </w:tbl>
     <w:p/>
     <w:p>
@@ -3024,7 +3076,7 @@
     </w:p>
     <w:p>
       <w:r>
-        <w:t>All 50 phases logged across four public repos. The interlinkage graph is now source-verified edge-by-edge: 12 confirmed, 2 resolved, 1 vindicated against the aggregators (NIPU-2026), 1 honestly disputed pending the official PDF, 1 still open (SEZ+PLI), and 12 new edges added -- on top of the operationally-live automation loop.</w:t>
+        <w:t>All 51 phases logged. The reportage is now audit-hardened (3,982 announcements, ~50%-&gt;near-parity coverage vs PRS/Drishti selection, displayed provenance) and the user's two EV decks carry twin-verified July-2026 facts, QA'd and delivered non-destructively to Drive/Dropbox.</w:t>
       </w:r>
     </w:p>
     <w:sectPr>

</xml_diff>

<commit_message>
docs: session summary phase 52 -- EV deck slides (arrears + leads) and python3 -> 3.14 fix
Co-Authored-By: Claude Fable 5 <noreply@anthropic.com>
</commit_message>
<xml_diff>
--- a/reports/published/session_summary_2026-07-19.docx
+++ b/reports/published/session_summary_2026-07-19.docx
@@ -2909,6 +2909,58 @@
           </w:p>
         </w:tc>
       </w:tr>
+      <w:tr>
+        <w:tc>
+          <w:tcPr>
+            <w:tcW w:type="dxa" w:w="1728"/>
+          </w:tcPr>
+          <w:p>
+            <w:r>
+              <w:t>52</w:t>
+            </w:r>
+          </w:p>
+        </w:tc>
+        <w:tc>
+          <w:tcPr>
+            <w:tcW w:type="dxa" w:w="1728"/>
+          </w:tcPr>
+          <w:p>
+            <w:r>
+              <w:t>EV decks gain state-arrears + leads slides; machine Python resolution fixed to 3.14</w:t>
+            </w:r>
+          </w:p>
+        </w:tc>
+        <w:tc>
+          <w:tcPr>
+            <w:tcW w:type="dxa" w:w="1728"/>
+          </w:tcPr>
+          <w:p>
+            <w:r>
+              <w:t>Google Drive / Dropbox (deck v2s) + machine setup (~/.zshrc)</w:t>
+            </w:r>
+          </w:p>
+        </w:tc>
+        <w:tc>
+          <w:tcPr>
+            <w:tcW w:type="dxa" w:w="1728"/>
+          </w:tcPr>
+          <w:p>
+            <w:r>
+              <w:t>(1) Both EV decks extended with one design-matched slide each, built from twin layers: the Market Evaluation deck (now 11 slides) gains 'State Incentive Reality Check' -- the arrears divide (Telangana Rs 3,736cr confirmed arrears, AP Rs 3,000-5,000cr FIFO-promised) vs the payers…</w:t>
+            </w:r>
+          </w:p>
+        </w:tc>
+        <w:tc>
+          <w:tcPr>
+            <w:tcW w:type="dxa" w:w="1728"/>
+          </w:tcPr>
+          <w:p>
+            <w:r>
+              <w:t>(2) PYTHON FIX: bare python3 resolved to Apple's frozen 3.9.6 because /usr/bin…; Deliberately untouched: twin cron jobs pin /usr/bin/python3 (stdlib-only) and k…; Verification-method footnote: zsh -lc misleadingly showed the old python becaus…</w:t>
+            </w:r>
+          </w:p>
+        </w:tc>
+      </w:tr>
     </w:tbl>
     <w:p/>
     <w:p>
@@ -3076,7 +3128,7 @@
     </w:p>
     <w:p>
       <w:r>
-        <w:t>All 51 phases logged. The reportage is now audit-hardened (3,982 announcements, ~50%-&gt;near-parity coverage vs PRS/Drishti selection, displayed provenance) and the user's two EV decks carry twin-verified July-2026 facts, QA'd and delivered non-destructively to Drive/Dropbox.</w:t>
+        <w:t>All 52 phases logged. The EV decks now carry the twin's performance layers (arrears, verified leads) as native slides in Drive/Dropbox, and the machine's python3 finally points at 3.14.6 -- ending the 3.9-era tooling friction without touching the pinned cron/venv paths.</w:t>
       </w:r>
     </w:p>
     <w:sectPr>

</xml_diff>